<commit_message>
add one more final iteration
</commit_message>
<xml_diff>
--- a/non_code/Eigenständigkeitserklärung.docx
+++ b/non_code/Eigenständigkeitserklärung.docx
@@ -1,6 +1,6 @@
 
 <file path=word/document.xml><?xml version="1.0" encoding="utf-8"?>
-<w:document xmlns:wpc="http://schemas.microsoft.com/office/word/2010/wordprocessingCanvas" xmlns:cx="http://schemas.microsoft.com/office/drawing/2014/chartex" xmlns:cx1="http://schemas.microsoft.com/office/drawing/2015/9/8/chartex" xmlns:cx2="http://schemas.microsoft.com/office/drawing/2015/10/21/chartex" xmlns:cx3="http://schemas.microsoft.com/office/drawing/2016/5/9/chartex" xmlns:cx4="http://schemas.microsoft.com/office/drawing/2016/5/10/chartex" xmlns:cx5="http://schemas.microsoft.com/office/drawing/2016/5/11/chartex" xmlns:cx6="http://schemas.microsoft.com/office/drawing/2016/5/12/chartex" xmlns:cx7="http://schemas.microsoft.com/office/drawing/2016/5/13/chartex" xmlns:cx8="http://schemas.microsoft.com/office/drawing/2016/5/14/chartex" xmlns:mc="http://schemas.openxmlformats.org/markup-compatibility/2006" xmlns:aink="http://schemas.microsoft.com/office/drawing/2016/ink" xmlns:am3d="http://schemas.microsoft.com/office/drawing/2017/model3d" xmlns:o="urn:schemas-microsoft-com:office:office" xmlns:oel="http://schemas.microsoft.com/office/2019/extlst" xmlns:r="http://schemas.openxmlformats.org/officeDocument/2006/relationships" xmlns:m="http://schemas.openxmlformats.org/officeDocument/2006/math" xmlns:v="urn:schemas-microsoft-com:vml" xmlns:wp14="http://schemas.microsoft.com/office/word/2010/wordprocessingDrawing" xmlns:wp="http://schemas.openxmlformats.org/drawingml/2006/wordprocessingDrawing" xmlns:w10="urn:schemas-microsoft-com:office:word" xmlns:w="http://schemas.openxmlformats.org/wordprocessingml/2006/main" xmlns:w14="http://schemas.microsoft.com/office/word/2010/wordml" xmlns:w15="http://schemas.microsoft.com/office/word/2012/wordml" xmlns:w16cex="http://schemas.microsoft.com/office/word/2018/wordml/cex" xmlns:w16cid="http://schemas.microsoft.com/office/word/2016/wordml/cid" xmlns:w16="http://schemas.microsoft.com/office/word/2018/wordml" xmlns:w16sdtdh="http://schemas.microsoft.com/office/word/2020/wordml/sdtdatahash" xmlns:w16se="http://schemas.microsoft.com/office/word/2015/wordml/symex" xmlns:wpg="http://schemas.microsoft.com/office/word/2010/wordprocessingGroup" xmlns:wpi="http://schemas.microsoft.com/office/word/2010/wordprocessingInk" xmlns:wne="http://schemas.microsoft.com/office/word/2006/wordml" xmlns:wps="http://schemas.microsoft.com/office/word/2010/wordprocessingShape" mc:Ignorable="w14 w15 w16se w16cid w16 w16cex w16sdtdh wp14">
+<w:document xmlns:wpc="http://schemas.microsoft.com/office/word/2010/wordprocessingCanvas" xmlns:cx="http://schemas.microsoft.com/office/drawing/2014/chartex" xmlns:cx1="http://schemas.microsoft.com/office/drawing/2015/9/8/chartex" xmlns:cx2="http://schemas.microsoft.com/office/drawing/2015/10/21/chartex" xmlns:cx3="http://schemas.microsoft.com/office/drawing/2016/5/9/chartex" xmlns:cx4="http://schemas.microsoft.com/office/drawing/2016/5/10/chartex" xmlns:cx5="http://schemas.microsoft.com/office/drawing/2016/5/11/chartex" xmlns:cx6="http://schemas.microsoft.com/office/drawing/2016/5/12/chartex" xmlns:cx7="http://schemas.microsoft.com/office/drawing/2016/5/13/chartex" xmlns:cx8="http://schemas.microsoft.com/office/drawing/2016/5/14/chartex" xmlns:mc="http://schemas.openxmlformats.org/markup-compatibility/2006" xmlns:aink="http://schemas.microsoft.com/office/drawing/2016/ink" xmlns:am3d="http://schemas.microsoft.com/office/drawing/2017/model3d" xmlns:o="urn:schemas-microsoft-com:office:office" xmlns:oel="http://schemas.microsoft.com/office/2019/extlst" xmlns:r="http://schemas.openxmlformats.org/officeDocument/2006/relationships" xmlns:m="http://schemas.openxmlformats.org/officeDocument/2006/math" xmlns:v="urn:schemas-microsoft-com:vml" xmlns:wp14="http://schemas.microsoft.com/office/word/2010/wordprocessingDrawing" xmlns:wp="http://schemas.openxmlformats.org/drawingml/2006/wordprocessingDrawing" xmlns:w10="urn:schemas-microsoft-com:office:word" xmlns:w="http://schemas.openxmlformats.org/wordprocessingml/2006/main" xmlns:w14="http://schemas.microsoft.com/office/word/2010/wordml" xmlns:w15="http://schemas.microsoft.com/office/word/2012/wordml" xmlns:w16cex="http://schemas.microsoft.com/office/word/2018/wordml/cex" xmlns:w16cid="http://schemas.microsoft.com/office/word/2016/wordml/cid" xmlns:w16="http://schemas.microsoft.com/office/word/2018/wordml" xmlns:w16du="http://schemas.microsoft.com/office/word/2023/wordml/word16du" xmlns:w16sdtdh="http://schemas.microsoft.com/office/word/2020/wordml/sdtdatahash" xmlns:w16sdtfl="http://schemas.microsoft.com/office/word/2024/wordml/sdtformatlock" xmlns:w16se="http://schemas.microsoft.com/office/word/2015/wordml/symex" xmlns:wpg="http://schemas.microsoft.com/office/word/2010/wordprocessingGroup" xmlns:wpi="http://schemas.microsoft.com/office/word/2010/wordprocessingInk" xmlns:wne="http://schemas.microsoft.com/office/word/2006/wordml" xmlns:wps="http://schemas.microsoft.com/office/word/2010/wordprocessingShape" mc:Ignorable="w14 w15 w16se w16cid w16 w16cex w16sdtdh w16sdtfl w16du wp14">
   <w:body>
     <w:p>
       <w:pPr>
@@ -70,7 +70,6 @@
               <w:bottom w:val="single" w:sz="8" w:space="0" w:color="A6A6A6"/>
               <w:right w:val="single" w:sz="8" w:space="0" w:color="A6A6A6"/>
             </w:tcBorders>
-            <w:shd w:val="clear" w:color="auto" w:fill="auto"/>
             <w:vAlign w:val="center"/>
             <w:hideMark/>
           </w:tcPr>
@@ -99,7 +98,6 @@
               <w:bottom w:val="single" w:sz="8" w:space="0" w:color="A6A6A6"/>
               <w:right w:val="single" w:sz="8" w:space="0" w:color="A6A6A6"/>
             </w:tcBorders>
-            <w:shd w:val="clear" w:color="auto" w:fill="auto"/>
             <w:vAlign w:val="center"/>
             <w:hideMark/>
           </w:tcPr>
@@ -151,39 +149,7 @@
                 <w:noProof/>
                 <w:lang w:eastAsia="de-DE"/>
               </w:rPr>
-              <w:t> </w:t>
-            </w:r>
-            <w:r>
-              <w:rPr>
-                <w:rFonts w:ascii="Inter" w:eastAsia="Times New Roman" w:hAnsi="Inter" w:cs="Calibri"/>
-                <w:noProof/>
-                <w:lang w:eastAsia="de-DE"/>
-              </w:rPr>
-              <w:t> </w:t>
-            </w:r>
-            <w:r>
-              <w:rPr>
-                <w:rFonts w:ascii="Inter" w:eastAsia="Times New Roman" w:hAnsi="Inter" w:cs="Calibri"/>
-                <w:noProof/>
-                <w:lang w:eastAsia="de-DE"/>
-              </w:rPr>
-              <w:t> </w:t>
-            </w:r>
-            <w:r>
-              <w:rPr>
-                <w:rFonts w:ascii="Inter" w:eastAsia="Times New Roman" w:hAnsi="Inter" w:cs="Calibri"/>
-                <w:noProof/>
-                <w:lang w:eastAsia="de-DE"/>
-              </w:rPr>
-              <w:t> </w:t>
-            </w:r>
-            <w:r>
-              <w:rPr>
-                <w:rFonts w:ascii="Inter" w:eastAsia="Times New Roman" w:hAnsi="Inter" w:cs="Calibri"/>
-                <w:noProof/>
-                <w:lang w:eastAsia="de-DE"/>
-              </w:rPr>
-              <w:t> </w:t>
+              <w:t>Wiese</w:t>
             </w:r>
             <w:r>
               <w:rPr>
@@ -209,7 +175,6 @@
               <w:bottom w:val="single" w:sz="8" w:space="0" w:color="A6A6A6"/>
               <w:right w:val="single" w:sz="8" w:space="0" w:color="A6A6A6"/>
             </w:tcBorders>
-            <w:shd w:val="clear" w:color="auto" w:fill="auto"/>
             <w:vAlign w:val="center"/>
             <w:hideMark/>
           </w:tcPr>
@@ -238,7 +203,6 @@
               <w:bottom w:val="single" w:sz="8" w:space="0" w:color="A6A6A6"/>
               <w:right w:val="single" w:sz="8" w:space="0" w:color="A6A6A6"/>
             </w:tcBorders>
-            <w:shd w:val="clear" w:color="auto" w:fill="auto"/>
             <w:vAlign w:val="center"/>
             <w:hideMark/>
           </w:tcPr>
@@ -289,39 +253,7 @@
                 <w:noProof/>
                 <w:lang w:eastAsia="de-DE"/>
               </w:rPr>
-              <w:t> </w:t>
-            </w:r>
-            <w:r>
-              <w:rPr>
-                <w:rFonts w:ascii="Inter" w:eastAsia="Times New Roman" w:hAnsi="Inter" w:cs="Calibri"/>
-                <w:noProof/>
-                <w:lang w:eastAsia="de-DE"/>
-              </w:rPr>
-              <w:t> </w:t>
-            </w:r>
-            <w:r>
-              <w:rPr>
-                <w:rFonts w:ascii="Inter" w:eastAsia="Times New Roman" w:hAnsi="Inter" w:cs="Calibri"/>
-                <w:noProof/>
-                <w:lang w:eastAsia="de-DE"/>
-              </w:rPr>
-              <w:t> </w:t>
-            </w:r>
-            <w:r>
-              <w:rPr>
-                <w:rFonts w:ascii="Inter" w:eastAsia="Times New Roman" w:hAnsi="Inter" w:cs="Calibri"/>
-                <w:noProof/>
-                <w:lang w:eastAsia="de-DE"/>
-              </w:rPr>
-              <w:t> </w:t>
-            </w:r>
-            <w:r>
-              <w:rPr>
-                <w:rFonts w:ascii="Inter" w:eastAsia="Times New Roman" w:hAnsi="Inter" w:cs="Calibri"/>
-                <w:noProof/>
-                <w:lang w:eastAsia="de-DE"/>
-              </w:rPr>
-              <w:t> </w:t>
+              <w:t>Edwin</w:t>
             </w:r>
             <w:r>
               <w:rPr>
@@ -346,7 +278,6 @@
               <w:bottom w:val="single" w:sz="8" w:space="0" w:color="A6A6A6"/>
               <w:right w:val="single" w:sz="8" w:space="0" w:color="A6A6A6"/>
             </w:tcBorders>
-            <w:shd w:val="clear" w:color="auto" w:fill="auto"/>
             <w:vAlign w:val="center"/>
             <w:hideMark/>
           </w:tcPr>
@@ -375,7 +306,6 @@
               <w:bottom w:val="single" w:sz="8" w:space="0" w:color="A6A6A6"/>
               <w:right w:val="single" w:sz="8" w:space="0" w:color="A6A6A6"/>
             </w:tcBorders>
-            <w:shd w:val="clear" w:color="auto" w:fill="auto"/>
             <w:vAlign w:val="center"/>
             <w:hideMark/>
           </w:tcPr>
@@ -483,7 +413,6 @@
               <w:bottom w:val="single" w:sz="8" w:space="0" w:color="A6A6A6"/>
               <w:right w:val="single" w:sz="8" w:space="0" w:color="A6A6A6"/>
             </w:tcBorders>
-            <w:shd w:val="clear" w:color="auto" w:fill="auto"/>
             <w:vAlign w:val="center"/>
             <w:hideMark/>
           </w:tcPr>
@@ -519,7 +448,6 @@
               <w:bottom w:val="single" w:sz="8" w:space="0" w:color="A6A6A6"/>
               <w:right w:val="single" w:sz="8" w:space="0" w:color="A6A6A6"/>
             </w:tcBorders>
-            <w:shd w:val="clear" w:color="auto" w:fill="auto"/>
             <w:vAlign w:val="center"/>
             <w:hideMark/>
           </w:tcPr>
@@ -567,39 +495,41 @@
             <w:r>
               <w:rPr>
                 <w:rFonts w:ascii="Inter" w:eastAsia="Times New Roman" w:hAnsi="Inter" w:cs="Calibri"/>
-                <w:noProof/>
-                <w:lang w:eastAsia="de-DE"/>
-              </w:rPr>
-              <w:t> </w:t>
-            </w:r>
-            <w:r>
-              <w:rPr>
-                <w:rFonts w:ascii="Inter" w:eastAsia="Times New Roman" w:hAnsi="Inter" w:cs="Calibri"/>
-                <w:noProof/>
-                <w:lang w:eastAsia="de-DE"/>
-              </w:rPr>
-              <w:t> </w:t>
-            </w:r>
-            <w:r>
-              <w:rPr>
-                <w:rFonts w:ascii="Inter" w:eastAsia="Times New Roman" w:hAnsi="Inter" w:cs="Calibri"/>
-                <w:noProof/>
-                <w:lang w:eastAsia="de-DE"/>
-              </w:rPr>
-              <w:t> </w:t>
-            </w:r>
-            <w:r>
-              <w:rPr>
-                <w:rFonts w:ascii="Inter" w:eastAsia="Times New Roman" w:hAnsi="Inter" w:cs="Calibri"/>
-                <w:noProof/>
-                <w:lang w:eastAsia="de-DE"/>
-              </w:rPr>
-              <w:t> </w:t>
-            </w:r>
-            <w:r>
-              <w:rPr>
-                <w:rFonts w:ascii="Inter" w:eastAsia="Times New Roman" w:hAnsi="Inter" w:cs="Calibri"/>
-                <w:noProof/>
+                <w:lang w:eastAsia="de-DE"/>
+              </w:rPr>
+              <w:t>ADSC11 Master ADS-01</w:t>
+            </w:r>
+            <w:r>
+              <w:rPr>
+                <w:rFonts w:ascii="Inter" w:eastAsia="Times New Roman" w:hAnsi="Inter" w:cs="Calibri"/>
+                <w:lang w:eastAsia="de-DE"/>
+              </w:rPr>
+              <w:t> </w:t>
+            </w:r>
+            <w:r>
+              <w:rPr>
+                <w:rFonts w:ascii="Inter" w:eastAsia="Times New Roman" w:hAnsi="Inter" w:cs="Calibri"/>
+                <w:lang w:eastAsia="de-DE"/>
+              </w:rPr>
+              <w:t> </w:t>
+            </w:r>
+            <w:r>
+              <w:rPr>
+                <w:rFonts w:ascii="Inter" w:eastAsia="Times New Roman" w:hAnsi="Inter" w:cs="Calibri"/>
+                <w:lang w:eastAsia="de-DE"/>
+              </w:rPr>
+              <w:t> </w:t>
+            </w:r>
+            <w:r>
+              <w:rPr>
+                <w:rFonts w:ascii="Inter" w:eastAsia="Times New Roman" w:hAnsi="Inter" w:cs="Calibri"/>
+                <w:lang w:eastAsia="de-DE"/>
+              </w:rPr>
+              <w:t> </w:t>
+            </w:r>
+            <w:r>
+              <w:rPr>
+                <w:rFonts w:ascii="Inter" w:eastAsia="Times New Roman" w:hAnsi="Inter" w:cs="Calibri"/>
                 <w:lang w:eastAsia="de-DE"/>
               </w:rPr>
               <w:t> </w:t>
@@ -627,7 +557,6 @@
               <w:bottom w:val="single" w:sz="8" w:space="0" w:color="A6A6A6"/>
               <w:right w:val="single" w:sz="8" w:space="0" w:color="A6A6A6"/>
             </w:tcBorders>
-            <w:shd w:val="clear" w:color="auto" w:fill="auto"/>
             <w:vAlign w:val="center"/>
             <w:hideMark/>
           </w:tcPr>
@@ -663,7 +592,6 @@
               <w:bottom w:val="single" w:sz="8" w:space="0" w:color="A6A6A6"/>
               <w:right w:val="single" w:sz="8" w:space="0" w:color="A6A6A6"/>
             </w:tcBorders>
-            <w:shd w:val="clear" w:color="auto" w:fill="auto"/>
             <w:vAlign w:val="center"/>
             <w:hideMark/>
           </w:tcPr>
@@ -714,39 +642,7 @@
                 <w:noProof/>
                 <w:lang w:eastAsia="de-DE"/>
               </w:rPr>
-              <w:t> </w:t>
-            </w:r>
-            <w:r>
-              <w:rPr>
-                <w:rFonts w:ascii="Inter" w:eastAsia="Times New Roman" w:hAnsi="Inter" w:cs="Calibri"/>
-                <w:noProof/>
-                <w:lang w:eastAsia="de-DE"/>
-              </w:rPr>
-              <w:t> </w:t>
-            </w:r>
-            <w:r>
-              <w:rPr>
-                <w:rFonts w:ascii="Inter" w:eastAsia="Times New Roman" w:hAnsi="Inter" w:cs="Calibri"/>
-                <w:noProof/>
-                <w:lang w:eastAsia="de-DE"/>
-              </w:rPr>
-              <w:t> </w:t>
-            </w:r>
-            <w:r>
-              <w:rPr>
-                <w:rFonts w:ascii="Inter" w:eastAsia="Times New Roman" w:hAnsi="Inter" w:cs="Calibri"/>
-                <w:noProof/>
-                <w:lang w:eastAsia="de-DE"/>
-              </w:rPr>
-              <w:t> </w:t>
-            </w:r>
-            <w:r>
-              <w:rPr>
-                <w:rFonts w:ascii="Inter" w:eastAsia="Times New Roman" w:hAnsi="Inter" w:cs="Calibri"/>
-                <w:noProof/>
-                <w:lang w:eastAsia="de-DE"/>
-              </w:rPr>
-              <w:t> </w:t>
+              <w:t>Wortwandel Klimasuffix</w:t>
             </w:r>
             <w:r>
               <w:rPr>
@@ -771,7 +667,6 @@
               <w:bottom w:val="single" w:sz="8" w:space="0" w:color="A6A6A6"/>
               <w:right w:val="single" w:sz="8" w:space="0" w:color="A6A6A6"/>
             </w:tcBorders>
-            <w:shd w:val="clear" w:color="auto" w:fill="auto"/>
             <w:vAlign w:val="center"/>
             <w:hideMark/>
           </w:tcPr>
@@ -800,7 +695,6 @@
               <w:bottom w:val="single" w:sz="8" w:space="0" w:color="A6A6A6"/>
               <w:right w:val="single" w:sz="8" w:space="0" w:color="A6A6A6"/>
             </w:tcBorders>
-            <w:shd w:val="clear" w:color="auto" w:fill="auto"/>
             <w:vAlign w:val="center"/>
             <w:hideMark/>
           </w:tcPr>
@@ -851,39 +745,7 @@
                 <w:noProof/>
                 <w:lang w:eastAsia="de-DE"/>
               </w:rPr>
-              <w:t> </w:t>
-            </w:r>
-            <w:r>
-              <w:rPr>
-                <w:rFonts w:ascii="Inter" w:eastAsia="Times New Roman" w:hAnsi="Inter" w:cs="Calibri"/>
-                <w:noProof/>
-                <w:lang w:eastAsia="de-DE"/>
-              </w:rPr>
-              <w:t> </w:t>
-            </w:r>
-            <w:r>
-              <w:rPr>
-                <w:rFonts w:ascii="Inter" w:eastAsia="Times New Roman" w:hAnsi="Inter" w:cs="Calibri"/>
-                <w:noProof/>
-                <w:lang w:eastAsia="de-DE"/>
-              </w:rPr>
-              <w:t> </w:t>
-            </w:r>
-            <w:r>
-              <w:rPr>
-                <w:rFonts w:ascii="Inter" w:eastAsia="Times New Roman" w:hAnsi="Inter" w:cs="Calibri"/>
-                <w:noProof/>
-                <w:lang w:eastAsia="de-DE"/>
-              </w:rPr>
-              <w:t> </w:t>
-            </w:r>
-            <w:r>
-              <w:rPr>
-                <w:rFonts w:ascii="Inter" w:eastAsia="Times New Roman" w:hAnsi="Inter" w:cs="Calibri"/>
-                <w:noProof/>
-                <w:lang w:eastAsia="de-DE"/>
-              </w:rPr>
-              <w:t> </w:t>
+              <w:t>Marcel Hebing</w:t>
             </w:r>
             <w:r>
               <w:rPr>
@@ -908,7 +770,6 @@
               <w:bottom w:val="single" w:sz="8" w:space="0" w:color="A6A6A6"/>
               <w:right w:val="single" w:sz="8" w:space="0" w:color="A6A6A6"/>
             </w:tcBorders>
-            <w:shd w:val="clear" w:color="auto" w:fill="auto"/>
             <w:vAlign w:val="center"/>
             <w:hideMark/>
           </w:tcPr>
@@ -937,7 +798,6 @@
               <w:bottom w:val="single" w:sz="8" w:space="0" w:color="A6A6A6"/>
               <w:right w:val="single" w:sz="8" w:space="0" w:color="A6A6A6"/>
             </w:tcBorders>
-            <w:shd w:val="clear" w:color="auto" w:fill="auto"/>
             <w:vAlign w:val="center"/>
             <w:hideMark/>
           </w:tcPr>
@@ -985,42 +845,9 @@
             <w:r>
               <w:rPr>
                 <w:rFonts w:ascii="Inter" w:eastAsia="Times New Roman" w:hAnsi="Inter" w:cs="Calibri"/>
-                <w:noProof/>
-                <w:lang w:eastAsia="de-DE"/>
-              </w:rPr>
-              <w:t> </w:t>
-            </w:r>
-            <w:r>
-              <w:rPr>
-                <w:rFonts w:ascii="Inter" w:eastAsia="Times New Roman" w:hAnsi="Inter" w:cs="Calibri"/>
-                <w:noProof/>
-                <w:lang w:eastAsia="de-DE"/>
-              </w:rPr>
-              <w:t> </w:t>
-            </w:r>
-            <w:r>
-              <w:rPr>
-                <w:rFonts w:ascii="Inter" w:eastAsia="Times New Roman" w:hAnsi="Inter" w:cs="Calibri"/>
-                <w:noProof/>
-                <w:lang w:eastAsia="de-DE"/>
-              </w:rPr>
-              <w:t> </w:t>
-            </w:r>
-            <w:r>
-              <w:rPr>
-                <w:rFonts w:ascii="Inter" w:eastAsia="Times New Roman" w:hAnsi="Inter" w:cs="Calibri"/>
-                <w:noProof/>
-                <w:lang w:eastAsia="de-DE"/>
-              </w:rPr>
-              <w:t> </w:t>
-            </w:r>
-            <w:r>
-              <w:rPr>
-                <w:rFonts w:ascii="Inter" w:eastAsia="Times New Roman" w:hAnsi="Inter" w:cs="Calibri"/>
-                <w:noProof/>
-                <w:lang w:eastAsia="de-DE"/>
-              </w:rPr>
-              <w:t> </w:t>
+                <w:lang w:eastAsia="de-DE"/>
+              </w:rPr>
+              <w:t>25.05.2026</w:t>
             </w:r>
             <w:r>
               <w:rPr>
@@ -1157,6 +984,7 @@
             <w:checkBox>
               <w:sizeAuto/>
               <w:default w:val="0"/>
+              <w:checked/>
             </w:checkBox>
           </w:ffData>
         </w:fldChar>
@@ -1250,6 +1078,7 @@
             <w:checkBox>
               <w:sizeAuto/>
               <w:default w:val="0"/>
+              <w:checked/>
             </w:checkBox>
           </w:ffData>
         </w:fldChar>
@@ -1395,6 +1224,7 @@
             <w:checkBox>
               <w:sizeAuto/>
               <w:default w:val="0"/>
+              <w:checked/>
             </w:checkBox>
           </w:ffData>
         </w:fldChar>
@@ -2319,39 +2149,15 @@
                 <w:noProof/>
                 <w:lang w:eastAsia="de-DE"/>
               </w:rPr>
-              <w:t> </w:t>
-            </w:r>
-            <w:r>
-              <w:rPr>
-                <w:rFonts w:ascii="Inter" w:eastAsia="Times New Roman" w:hAnsi="Inter" w:cs="Calibri"/>
-                <w:noProof/>
-                <w:lang w:eastAsia="de-DE"/>
-              </w:rPr>
-              <w:t> </w:t>
-            </w:r>
-            <w:r>
-              <w:rPr>
-                <w:rFonts w:ascii="Inter" w:eastAsia="Times New Roman" w:hAnsi="Inter" w:cs="Calibri"/>
-                <w:noProof/>
-                <w:lang w:eastAsia="de-DE"/>
-              </w:rPr>
-              <w:t> </w:t>
-            </w:r>
-            <w:r>
-              <w:rPr>
-                <w:rFonts w:ascii="Inter" w:eastAsia="Times New Roman" w:hAnsi="Inter" w:cs="Calibri"/>
-                <w:noProof/>
-                <w:lang w:eastAsia="de-DE"/>
-              </w:rPr>
-              <w:t> </w:t>
-            </w:r>
-            <w:r>
-              <w:rPr>
-                <w:rFonts w:ascii="Inter" w:eastAsia="Times New Roman" w:hAnsi="Inter" w:cs="Calibri"/>
-                <w:noProof/>
-                <w:lang w:eastAsia="de-DE"/>
-              </w:rPr>
-              <w:t> </w:t>
+              <w:t xml:space="preserve">VSC </w:t>
+            </w:r>
+            <w:r>
+              <w:rPr>
+                <w:rFonts w:ascii="Inter" w:eastAsia="Times New Roman" w:hAnsi="Inter" w:cs="Calibri"/>
+                <w:noProof/>
+                <w:lang w:eastAsia="de-DE"/>
+              </w:rPr>
+              <w:t>Copilot Pro</w:t>
             </w:r>
             <w:r>
               <w:rPr>
@@ -2409,42 +2215,9 @@
             <w:r>
               <w:rPr>
                 <w:rFonts w:ascii="Inter" w:eastAsia="Times New Roman" w:hAnsi="Inter" w:cs="Calibri"/>
-                <w:noProof/>
-                <w:lang w:eastAsia="de-DE"/>
-              </w:rPr>
-              <w:t> </w:t>
-            </w:r>
-            <w:r>
-              <w:rPr>
-                <w:rFonts w:ascii="Inter" w:eastAsia="Times New Roman" w:hAnsi="Inter" w:cs="Calibri"/>
-                <w:noProof/>
-                <w:lang w:eastAsia="de-DE"/>
-              </w:rPr>
-              <w:t> </w:t>
-            </w:r>
-            <w:r>
-              <w:rPr>
-                <w:rFonts w:ascii="Inter" w:eastAsia="Times New Roman" w:hAnsi="Inter" w:cs="Calibri"/>
-                <w:noProof/>
-                <w:lang w:eastAsia="de-DE"/>
-              </w:rPr>
-              <w:t> </w:t>
-            </w:r>
-            <w:r>
-              <w:rPr>
-                <w:rFonts w:ascii="Inter" w:eastAsia="Times New Roman" w:hAnsi="Inter" w:cs="Calibri"/>
-                <w:noProof/>
-                <w:lang w:eastAsia="de-DE"/>
-              </w:rPr>
-              <w:t> </w:t>
-            </w:r>
-            <w:r>
-              <w:rPr>
-                <w:rFonts w:ascii="Inter" w:eastAsia="Times New Roman" w:hAnsi="Inter" w:cs="Calibri"/>
-                <w:noProof/>
-                <w:lang w:eastAsia="de-DE"/>
-              </w:rPr>
-              <w:t> </w:t>
+                <w:lang w:eastAsia="de-DE"/>
+              </w:rPr>
+              <w:t>Coding, Textumschreibungen, Tests</w:t>
             </w:r>
             <w:r>
               <w:rPr>
@@ -2505,39 +2278,7 @@
                 <w:noProof/>
                 <w:lang w:eastAsia="de-DE"/>
               </w:rPr>
-              <w:t> </w:t>
-            </w:r>
-            <w:r>
-              <w:rPr>
-                <w:rFonts w:ascii="Inter" w:eastAsia="Times New Roman" w:hAnsi="Inter" w:cs="Calibri"/>
-                <w:noProof/>
-                <w:lang w:eastAsia="de-DE"/>
-              </w:rPr>
-              <w:t> </w:t>
-            </w:r>
-            <w:r>
-              <w:rPr>
-                <w:rFonts w:ascii="Inter" w:eastAsia="Times New Roman" w:hAnsi="Inter" w:cs="Calibri"/>
-                <w:noProof/>
-                <w:lang w:eastAsia="de-DE"/>
-              </w:rPr>
-              <w:t> </w:t>
-            </w:r>
-            <w:r>
-              <w:rPr>
-                <w:rFonts w:ascii="Inter" w:eastAsia="Times New Roman" w:hAnsi="Inter" w:cs="Calibri"/>
-                <w:noProof/>
-                <w:lang w:eastAsia="de-DE"/>
-              </w:rPr>
-              <w:t> </w:t>
-            </w:r>
-            <w:r>
-              <w:rPr>
-                <w:rFonts w:ascii="Inter" w:eastAsia="Times New Roman" w:hAnsi="Inter" w:cs="Calibri"/>
-                <w:noProof/>
-                <w:lang w:eastAsia="de-DE"/>
-              </w:rPr>
-              <w:t> </w:t>
+              <w:t>Code, Arbeit</w:t>
             </w:r>
             <w:r>
               <w:rPr>
@@ -2602,39 +2343,7 @@
                 <w:noProof/>
                 <w:lang w:eastAsia="de-DE"/>
               </w:rPr>
-              <w:t> </w:t>
-            </w:r>
-            <w:r>
-              <w:rPr>
-                <w:rFonts w:ascii="Inter" w:eastAsia="Times New Roman" w:hAnsi="Inter" w:cs="Calibri"/>
-                <w:noProof/>
-                <w:lang w:eastAsia="de-DE"/>
-              </w:rPr>
-              <w:t> </w:t>
-            </w:r>
-            <w:r>
-              <w:rPr>
-                <w:rFonts w:ascii="Inter" w:eastAsia="Times New Roman" w:hAnsi="Inter" w:cs="Calibri"/>
-                <w:noProof/>
-                <w:lang w:eastAsia="de-DE"/>
-              </w:rPr>
-              <w:t> </w:t>
-            </w:r>
-            <w:r>
-              <w:rPr>
-                <w:rFonts w:ascii="Inter" w:eastAsia="Times New Roman" w:hAnsi="Inter" w:cs="Calibri"/>
-                <w:noProof/>
-                <w:lang w:eastAsia="de-DE"/>
-              </w:rPr>
-              <w:t> </w:t>
-            </w:r>
-            <w:r>
-              <w:rPr>
-                <w:rFonts w:ascii="Inter" w:eastAsia="Times New Roman" w:hAnsi="Inter" w:cs="Calibri"/>
-                <w:noProof/>
-                <w:lang w:eastAsia="de-DE"/>
-              </w:rPr>
-              <w:t> </w:t>
+              <w:t>Claude Web</w:t>
             </w:r>
             <w:r>
               <w:rPr>
@@ -2695,39 +2404,7 @@
                 <w:noProof/>
                 <w:lang w:eastAsia="de-DE"/>
               </w:rPr>
-              <w:t> </w:t>
-            </w:r>
-            <w:r>
-              <w:rPr>
-                <w:rFonts w:ascii="Inter" w:eastAsia="Times New Roman" w:hAnsi="Inter" w:cs="Calibri"/>
-                <w:noProof/>
-                <w:lang w:eastAsia="de-DE"/>
-              </w:rPr>
-              <w:t> </w:t>
-            </w:r>
-            <w:r>
-              <w:rPr>
-                <w:rFonts w:ascii="Inter" w:eastAsia="Times New Roman" w:hAnsi="Inter" w:cs="Calibri"/>
-                <w:noProof/>
-                <w:lang w:eastAsia="de-DE"/>
-              </w:rPr>
-              <w:t> </w:t>
-            </w:r>
-            <w:r>
-              <w:rPr>
-                <w:rFonts w:ascii="Inter" w:eastAsia="Times New Roman" w:hAnsi="Inter" w:cs="Calibri"/>
-                <w:noProof/>
-                <w:lang w:eastAsia="de-DE"/>
-              </w:rPr>
-              <w:t> </w:t>
-            </w:r>
-            <w:r>
-              <w:rPr>
-                <w:rFonts w:ascii="Inter" w:eastAsia="Times New Roman" w:hAnsi="Inter" w:cs="Calibri"/>
-                <w:noProof/>
-                <w:lang w:eastAsia="de-DE"/>
-              </w:rPr>
-              <w:t> </w:t>
+              <w:t>Verbessern von Plot functions</w:t>
             </w:r>
             <w:r>
               <w:rPr>
@@ -2788,39 +2465,7 @@
                 <w:noProof/>
                 <w:lang w:eastAsia="de-DE"/>
               </w:rPr>
-              <w:t> </w:t>
-            </w:r>
-            <w:r>
-              <w:rPr>
-                <w:rFonts w:ascii="Inter" w:eastAsia="Times New Roman" w:hAnsi="Inter" w:cs="Calibri"/>
-                <w:noProof/>
-                <w:lang w:eastAsia="de-DE"/>
-              </w:rPr>
-              <w:t> </w:t>
-            </w:r>
-            <w:r>
-              <w:rPr>
-                <w:rFonts w:ascii="Inter" w:eastAsia="Times New Roman" w:hAnsi="Inter" w:cs="Calibri"/>
-                <w:noProof/>
-                <w:lang w:eastAsia="de-DE"/>
-              </w:rPr>
-              <w:t> </w:t>
-            </w:r>
-            <w:r>
-              <w:rPr>
-                <w:rFonts w:ascii="Inter" w:eastAsia="Times New Roman" w:hAnsi="Inter" w:cs="Calibri"/>
-                <w:noProof/>
-                <w:lang w:eastAsia="de-DE"/>
-              </w:rPr>
-              <w:t> </w:t>
-            </w:r>
-            <w:r>
-              <w:rPr>
-                <w:rFonts w:ascii="Inter" w:eastAsia="Times New Roman" w:hAnsi="Inter" w:cs="Calibri"/>
-                <w:noProof/>
-                <w:lang w:eastAsia="de-DE"/>
-              </w:rPr>
-              <w:t> </w:t>
+              <w:t>Code</w:t>
             </w:r>
             <w:r>
               <w:rPr>
@@ -2885,39 +2530,7 @@
                 <w:noProof/>
                 <w:lang w:eastAsia="de-DE"/>
               </w:rPr>
-              <w:t> </w:t>
-            </w:r>
-            <w:r>
-              <w:rPr>
-                <w:rFonts w:ascii="Inter" w:eastAsia="Times New Roman" w:hAnsi="Inter" w:cs="Calibri"/>
-                <w:noProof/>
-                <w:lang w:eastAsia="de-DE"/>
-              </w:rPr>
-              <w:t> </w:t>
-            </w:r>
-            <w:r>
-              <w:rPr>
-                <w:rFonts w:ascii="Inter" w:eastAsia="Times New Roman" w:hAnsi="Inter" w:cs="Calibri"/>
-                <w:noProof/>
-                <w:lang w:eastAsia="de-DE"/>
-              </w:rPr>
-              <w:t> </w:t>
-            </w:r>
-            <w:r>
-              <w:rPr>
-                <w:rFonts w:ascii="Inter" w:eastAsia="Times New Roman" w:hAnsi="Inter" w:cs="Calibri"/>
-                <w:noProof/>
-                <w:lang w:eastAsia="de-DE"/>
-              </w:rPr>
-              <w:t> </w:t>
-            </w:r>
-            <w:r>
-              <w:rPr>
-                <w:rFonts w:ascii="Inter" w:eastAsia="Times New Roman" w:hAnsi="Inter" w:cs="Calibri"/>
-                <w:noProof/>
-                <w:lang w:eastAsia="de-DE"/>
-              </w:rPr>
-              <w:t> </w:t>
+              <w:t xml:space="preserve">ChatGPT, </w:t>
             </w:r>
             <w:r>
               <w:rPr>
@@ -2978,39 +2591,7 @@
                 <w:noProof/>
                 <w:lang w:eastAsia="de-DE"/>
               </w:rPr>
-              <w:t> </w:t>
-            </w:r>
-            <w:r>
-              <w:rPr>
-                <w:rFonts w:ascii="Inter" w:eastAsia="Times New Roman" w:hAnsi="Inter" w:cs="Calibri"/>
-                <w:noProof/>
-                <w:lang w:eastAsia="de-DE"/>
-              </w:rPr>
-              <w:t> </w:t>
-            </w:r>
-            <w:r>
-              <w:rPr>
-                <w:rFonts w:ascii="Inter" w:eastAsia="Times New Roman" w:hAnsi="Inter" w:cs="Calibri"/>
-                <w:noProof/>
-                <w:lang w:eastAsia="de-DE"/>
-              </w:rPr>
-              <w:t> </w:t>
-            </w:r>
-            <w:r>
-              <w:rPr>
-                <w:rFonts w:ascii="Inter" w:eastAsia="Times New Roman" w:hAnsi="Inter" w:cs="Calibri"/>
-                <w:noProof/>
-                <w:lang w:eastAsia="de-DE"/>
-              </w:rPr>
-              <w:t> </w:t>
-            </w:r>
-            <w:r>
-              <w:rPr>
-                <w:rFonts w:ascii="Inter" w:eastAsia="Times New Roman" w:hAnsi="Inter" w:cs="Calibri"/>
-                <w:noProof/>
-                <w:lang w:eastAsia="de-DE"/>
-              </w:rPr>
-              <w:t> </w:t>
+              <w:t>Research Paper</w:t>
             </w:r>
             <w:r>
               <w:rPr>
@@ -3071,39 +2652,7 @@
                 <w:noProof/>
                 <w:lang w:eastAsia="de-DE"/>
               </w:rPr>
-              <w:t> </w:t>
-            </w:r>
-            <w:r>
-              <w:rPr>
-                <w:rFonts w:ascii="Inter" w:eastAsia="Times New Roman" w:hAnsi="Inter" w:cs="Calibri"/>
-                <w:noProof/>
-                <w:lang w:eastAsia="de-DE"/>
-              </w:rPr>
-              <w:t> </w:t>
-            </w:r>
-            <w:r>
-              <w:rPr>
-                <w:rFonts w:ascii="Inter" w:eastAsia="Times New Roman" w:hAnsi="Inter" w:cs="Calibri"/>
-                <w:noProof/>
-                <w:lang w:eastAsia="de-DE"/>
-              </w:rPr>
-              <w:t> </w:t>
-            </w:r>
-            <w:r>
-              <w:rPr>
-                <w:rFonts w:ascii="Inter" w:eastAsia="Times New Roman" w:hAnsi="Inter" w:cs="Calibri"/>
-                <w:noProof/>
-                <w:lang w:eastAsia="de-DE"/>
-              </w:rPr>
-              <w:t> </w:t>
-            </w:r>
-            <w:r>
-              <w:rPr>
-                <w:rFonts w:ascii="Inter" w:eastAsia="Times New Roman" w:hAnsi="Inter" w:cs="Calibri"/>
-                <w:noProof/>
-                <w:lang w:eastAsia="de-DE"/>
-              </w:rPr>
-              <w:t> </w:t>
+              <w:t>Arbeit, Quellen</w:t>
             </w:r>
             <w:r>
               <w:rPr>
@@ -7983,7 +7532,6 @@
         <w:tc>
           <w:tcPr>
             <w:tcW w:w="3392" w:type="dxa"/>
-            <w:shd w:val="clear" w:color="auto" w:fill="auto"/>
             <w:vAlign w:val="center"/>
             <w:hideMark/>
           </w:tcPr>
@@ -8006,7 +7554,6 @@
         <w:tc>
           <w:tcPr>
             <w:tcW w:w="5588" w:type="dxa"/>
-            <w:shd w:val="clear" w:color="auto" w:fill="auto"/>
             <w:vAlign w:val="center"/>
             <w:hideMark/>
           </w:tcPr>
@@ -8061,42 +7608,9 @@
             <w:r>
               <w:rPr>
                 <w:rFonts w:ascii="Inter" w:eastAsia="Times New Roman" w:hAnsi="Inter" w:cs="Calibri"/>
-                <w:noProof/>
-                <w:lang w:eastAsia="de-DE"/>
-              </w:rPr>
-              <w:t> </w:t>
-            </w:r>
-            <w:r>
-              <w:rPr>
-                <w:rFonts w:ascii="Inter" w:eastAsia="Times New Roman" w:hAnsi="Inter" w:cs="Calibri"/>
-                <w:noProof/>
-                <w:lang w:eastAsia="de-DE"/>
-              </w:rPr>
-              <w:t> </w:t>
-            </w:r>
-            <w:r>
-              <w:rPr>
-                <w:rFonts w:ascii="Inter" w:eastAsia="Times New Roman" w:hAnsi="Inter" w:cs="Calibri"/>
-                <w:noProof/>
-                <w:lang w:eastAsia="de-DE"/>
-              </w:rPr>
-              <w:t> </w:t>
-            </w:r>
-            <w:r>
-              <w:rPr>
-                <w:rFonts w:ascii="Inter" w:eastAsia="Times New Roman" w:hAnsi="Inter" w:cs="Calibri"/>
-                <w:noProof/>
-                <w:lang w:eastAsia="de-DE"/>
-              </w:rPr>
-              <w:t> </w:t>
-            </w:r>
-            <w:r>
-              <w:rPr>
-                <w:rFonts w:ascii="Inter" w:eastAsia="Times New Roman" w:hAnsi="Inter" w:cs="Calibri"/>
-                <w:noProof/>
-                <w:lang w:eastAsia="de-DE"/>
-              </w:rPr>
-              <w:t> </w:t>
+                <w:lang w:eastAsia="de-DE"/>
+              </w:rPr>
+              <w:t>Berlin</w:t>
             </w:r>
             <w:r>
               <w:rPr>
@@ -8115,7 +7629,6 @@
         <w:tc>
           <w:tcPr>
             <w:tcW w:w="3392" w:type="dxa"/>
-            <w:shd w:val="clear" w:color="auto" w:fill="auto"/>
             <w:vAlign w:val="center"/>
             <w:hideMark/>
           </w:tcPr>
@@ -8138,7 +7651,6 @@
         <w:tc>
           <w:tcPr>
             <w:tcW w:w="5588" w:type="dxa"/>
-            <w:shd w:val="clear" w:color="auto" w:fill="auto"/>
             <w:vAlign w:val="center"/>
             <w:hideMark/>
           </w:tcPr>
@@ -8196,39 +7708,7 @@
                 <w:noProof/>
                 <w:lang w:eastAsia="de-DE"/>
               </w:rPr>
-              <w:t> </w:t>
-            </w:r>
-            <w:r>
-              <w:rPr>
-                <w:rFonts w:ascii="Inter" w:eastAsia="Times New Roman" w:hAnsi="Inter" w:cs="Calibri"/>
-                <w:noProof/>
-                <w:lang w:eastAsia="de-DE"/>
-              </w:rPr>
-              <w:t> </w:t>
-            </w:r>
-            <w:r>
-              <w:rPr>
-                <w:rFonts w:ascii="Inter" w:eastAsia="Times New Roman" w:hAnsi="Inter" w:cs="Calibri"/>
-                <w:noProof/>
-                <w:lang w:eastAsia="de-DE"/>
-              </w:rPr>
-              <w:t> </w:t>
-            </w:r>
-            <w:r>
-              <w:rPr>
-                <w:rFonts w:ascii="Inter" w:eastAsia="Times New Roman" w:hAnsi="Inter" w:cs="Calibri"/>
-                <w:noProof/>
-                <w:lang w:eastAsia="de-DE"/>
-              </w:rPr>
-              <w:t> </w:t>
-            </w:r>
-            <w:r>
-              <w:rPr>
-                <w:rFonts w:ascii="Inter" w:eastAsia="Times New Roman" w:hAnsi="Inter" w:cs="Calibri"/>
-                <w:noProof/>
-                <w:lang w:eastAsia="de-DE"/>
-              </w:rPr>
-              <w:t> </w:t>
+              <w:t>25.05.2026</w:t>
             </w:r>
             <w:r>
               <w:rPr>
@@ -8279,14 +7759,7 @@
         <w:rPr>
           <w:rFonts w:ascii="Inter" w:hAnsi="Inter"/>
         </w:rPr>
-        <w:t xml:space="preserve">Unterschrift </w:t>
-      </w:r>
-      <w:proofErr w:type="spellStart"/>
-      <w:r>
-        <w:rPr>
-          <w:rFonts w:ascii="Inter" w:hAnsi="Inter"/>
-        </w:rPr>
-        <w:t>Student</w:t>
+        <w:t>Unterschrift Student</w:t>
       </w:r>
       <w:r>
         <w:rPr>
@@ -8300,7 +7773,6 @@
         </w:rPr>
         <w:t>in</w:t>
       </w:r>
-      <w:proofErr w:type="spellEnd"/>
     </w:p>
     <w:sectPr>
       <w:headerReference w:type="even" r:id="rId11"/>
@@ -8317,7 +7789,7 @@
 </file>
 
 <file path=word/endnotes.xml><?xml version="1.0" encoding="utf-8"?>
-<w:endnotes xmlns:wpc="http://schemas.microsoft.com/office/word/2010/wordprocessingCanvas" xmlns:cx="http://schemas.microsoft.com/office/drawing/2014/chartex" xmlns:cx1="http://schemas.microsoft.com/office/drawing/2015/9/8/chartex" xmlns:cx2="http://schemas.microsoft.com/office/drawing/2015/10/21/chartex" xmlns:cx3="http://schemas.microsoft.com/office/drawing/2016/5/9/chartex" xmlns:cx4="http://schemas.microsoft.com/office/drawing/2016/5/10/chartex" xmlns:cx5="http://schemas.microsoft.com/office/drawing/2016/5/11/chartex" xmlns:cx6="http://schemas.microsoft.com/office/drawing/2016/5/12/chartex" xmlns:cx7="http://schemas.microsoft.com/office/drawing/2016/5/13/chartex" xmlns:cx8="http://schemas.microsoft.com/office/drawing/2016/5/14/chartex" xmlns:mc="http://schemas.openxmlformats.org/markup-compatibility/2006" xmlns:aink="http://schemas.microsoft.com/office/drawing/2016/ink" xmlns:am3d="http://schemas.microsoft.com/office/drawing/2017/model3d" xmlns:o="urn:schemas-microsoft-com:office:office" xmlns:oel="http://schemas.microsoft.com/office/2019/extlst" xmlns:r="http://schemas.openxmlformats.org/officeDocument/2006/relationships" xmlns:m="http://schemas.openxmlformats.org/officeDocument/2006/math" xmlns:v="urn:schemas-microsoft-com:vml" xmlns:wp14="http://schemas.microsoft.com/office/word/2010/wordprocessingDrawing" xmlns:wp="http://schemas.openxmlformats.org/drawingml/2006/wordprocessingDrawing" xmlns:w10="urn:schemas-microsoft-com:office:word" xmlns:w="http://schemas.openxmlformats.org/wordprocessingml/2006/main" xmlns:w14="http://schemas.microsoft.com/office/word/2010/wordml" xmlns:w15="http://schemas.microsoft.com/office/word/2012/wordml" xmlns:w16cex="http://schemas.microsoft.com/office/word/2018/wordml/cex" xmlns:w16cid="http://schemas.microsoft.com/office/word/2016/wordml/cid" xmlns:w16="http://schemas.microsoft.com/office/word/2018/wordml" xmlns:w16sdtdh="http://schemas.microsoft.com/office/word/2020/wordml/sdtdatahash" xmlns:w16se="http://schemas.microsoft.com/office/word/2015/wordml/symex" xmlns:wpg="http://schemas.microsoft.com/office/word/2010/wordprocessingGroup" xmlns:wpi="http://schemas.microsoft.com/office/word/2010/wordprocessingInk" xmlns:wne="http://schemas.microsoft.com/office/word/2006/wordml" xmlns:wps="http://schemas.microsoft.com/office/word/2010/wordprocessingShape" mc:Ignorable="w14 w15 w16se w16cid w16 w16cex w16sdtdh wp14">
+<w:endnotes xmlns:wpc="http://schemas.microsoft.com/office/word/2010/wordprocessingCanvas" xmlns:cx="http://schemas.microsoft.com/office/drawing/2014/chartex" xmlns:cx1="http://schemas.microsoft.com/office/drawing/2015/9/8/chartex" xmlns:cx2="http://schemas.microsoft.com/office/drawing/2015/10/21/chartex" xmlns:cx3="http://schemas.microsoft.com/office/drawing/2016/5/9/chartex" xmlns:cx4="http://schemas.microsoft.com/office/drawing/2016/5/10/chartex" xmlns:cx5="http://schemas.microsoft.com/office/drawing/2016/5/11/chartex" xmlns:cx6="http://schemas.microsoft.com/office/drawing/2016/5/12/chartex" xmlns:cx7="http://schemas.microsoft.com/office/drawing/2016/5/13/chartex" xmlns:cx8="http://schemas.microsoft.com/office/drawing/2016/5/14/chartex" xmlns:mc="http://schemas.openxmlformats.org/markup-compatibility/2006" xmlns:aink="http://schemas.microsoft.com/office/drawing/2016/ink" xmlns:am3d="http://schemas.microsoft.com/office/drawing/2017/model3d" xmlns:o="urn:schemas-microsoft-com:office:office" xmlns:oel="http://schemas.microsoft.com/office/2019/extlst" xmlns:r="http://schemas.openxmlformats.org/officeDocument/2006/relationships" xmlns:m="http://schemas.openxmlformats.org/officeDocument/2006/math" xmlns:v="urn:schemas-microsoft-com:vml" xmlns:wp14="http://schemas.microsoft.com/office/word/2010/wordprocessingDrawing" xmlns:wp="http://schemas.openxmlformats.org/drawingml/2006/wordprocessingDrawing" xmlns:w10="urn:schemas-microsoft-com:office:word" xmlns:w="http://schemas.openxmlformats.org/wordprocessingml/2006/main" xmlns:w14="http://schemas.microsoft.com/office/word/2010/wordml" xmlns:w15="http://schemas.microsoft.com/office/word/2012/wordml" xmlns:w16cex="http://schemas.microsoft.com/office/word/2018/wordml/cex" xmlns:w16cid="http://schemas.microsoft.com/office/word/2016/wordml/cid" xmlns:w16="http://schemas.microsoft.com/office/word/2018/wordml" xmlns:w16du="http://schemas.microsoft.com/office/word/2023/wordml/word16du" xmlns:w16sdtdh="http://schemas.microsoft.com/office/word/2020/wordml/sdtdatahash" xmlns:w16sdtfl="http://schemas.microsoft.com/office/word/2024/wordml/sdtformatlock" xmlns:w16se="http://schemas.microsoft.com/office/word/2015/wordml/symex" xmlns:wpg="http://schemas.microsoft.com/office/word/2010/wordprocessingGroup" xmlns:wpi="http://schemas.microsoft.com/office/word/2010/wordprocessingInk" xmlns:wne="http://schemas.microsoft.com/office/word/2006/wordml" xmlns:wps="http://schemas.microsoft.com/office/word/2010/wordprocessingShape" mc:Ignorable="w14 w15 w16se w16cid w16 w16cex w16sdtdh w16sdtfl w16du wp14">
   <w:endnote w:type="separator" w:id="-1">
     <w:p>
       <w:pPr>
@@ -8349,7 +7821,7 @@
 </file>
 
 <file path=word/footer1.xml><?xml version="1.0" encoding="utf-8"?>
-<w:ftr xmlns:wpc="http://schemas.microsoft.com/office/word/2010/wordprocessingCanvas" xmlns:cx="http://schemas.microsoft.com/office/drawing/2014/chartex" xmlns:cx1="http://schemas.microsoft.com/office/drawing/2015/9/8/chartex" xmlns:cx2="http://schemas.microsoft.com/office/drawing/2015/10/21/chartex" xmlns:cx3="http://schemas.microsoft.com/office/drawing/2016/5/9/chartex" xmlns:cx4="http://schemas.microsoft.com/office/drawing/2016/5/10/chartex" xmlns:cx5="http://schemas.microsoft.com/office/drawing/2016/5/11/chartex" xmlns:cx6="http://schemas.microsoft.com/office/drawing/2016/5/12/chartex" xmlns:cx7="http://schemas.microsoft.com/office/drawing/2016/5/13/chartex" xmlns:cx8="http://schemas.microsoft.com/office/drawing/2016/5/14/chartex" xmlns:mc="http://schemas.openxmlformats.org/markup-compatibility/2006" xmlns:aink="http://schemas.microsoft.com/office/drawing/2016/ink" xmlns:am3d="http://schemas.microsoft.com/office/drawing/2017/model3d" xmlns:o="urn:schemas-microsoft-com:office:office" xmlns:oel="http://schemas.microsoft.com/office/2019/extlst" xmlns:r="http://schemas.openxmlformats.org/officeDocument/2006/relationships" xmlns:m="http://schemas.openxmlformats.org/officeDocument/2006/math" xmlns:v="urn:schemas-microsoft-com:vml" xmlns:wp14="http://schemas.microsoft.com/office/word/2010/wordprocessingDrawing" xmlns:wp="http://schemas.openxmlformats.org/drawingml/2006/wordprocessingDrawing" xmlns:w10="urn:schemas-microsoft-com:office:word" xmlns:w="http://schemas.openxmlformats.org/wordprocessingml/2006/main" xmlns:w14="http://schemas.microsoft.com/office/word/2010/wordml" xmlns:w15="http://schemas.microsoft.com/office/word/2012/wordml" xmlns:w16cex="http://schemas.microsoft.com/office/word/2018/wordml/cex" xmlns:w16cid="http://schemas.microsoft.com/office/word/2016/wordml/cid" xmlns:w16="http://schemas.microsoft.com/office/word/2018/wordml" xmlns:w16sdtdh="http://schemas.microsoft.com/office/word/2020/wordml/sdtdatahash" xmlns:w16se="http://schemas.microsoft.com/office/word/2015/wordml/symex" xmlns:wpg="http://schemas.microsoft.com/office/word/2010/wordprocessingGroup" xmlns:wpi="http://schemas.microsoft.com/office/word/2010/wordprocessingInk" xmlns:wne="http://schemas.microsoft.com/office/word/2006/wordml" xmlns:wps="http://schemas.microsoft.com/office/word/2010/wordprocessingShape" mc:Ignorable="w14 w15 w16se w16cid w16 w16cex w16sdtdh wp14">
+<w:ftr xmlns:wpc="http://schemas.microsoft.com/office/word/2010/wordprocessingCanvas" xmlns:cx="http://schemas.microsoft.com/office/drawing/2014/chartex" xmlns:cx1="http://schemas.microsoft.com/office/drawing/2015/9/8/chartex" xmlns:cx2="http://schemas.microsoft.com/office/drawing/2015/10/21/chartex" xmlns:cx3="http://schemas.microsoft.com/office/drawing/2016/5/9/chartex" xmlns:cx4="http://schemas.microsoft.com/office/drawing/2016/5/10/chartex" xmlns:cx5="http://schemas.microsoft.com/office/drawing/2016/5/11/chartex" xmlns:cx6="http://schemas.microsoft.com/office/drawing/2016/5/12/chartex" xmlns:cx7="http://schemas.microsoft.com/office/drawing/2016/5/13/chartex" xmlns:cx8="http://schemas.microsoft.com/office/drawing/2016/5/14/chartex" xmlns:mc="http://schemas.openxmlformats.org/markup-compatibility/2006" xmlns:aink="http://schemas.microsoft.com/office/drawing/2016/ink" xmlns:am3d="http://schemas.microsoft.com/office/drawing/2017/model3d" xmlns:o="urn:schemas-microsoft-com:office:office" xmlns:oel="http://schemas.microsoft.com/office/2019/extlst" xmlns:r="http://schemas.openxmlformats.org/officeDocument/2006/relationships" xmlns:m="http://schemas.openxmlformats.org/officeDocument/2006/math" xmlns:v="urn:schemas-microsoft-com:vml" xmlns:wp14="http://schemas.microsoft.com/office/word/2010/wordprocessingDrawing" xmlns:wp="http://schemas.openxmlformats.org/drawingml/2006/wordprocessingDrawing" xmlns:w10="urn:schemas-microsoft-com:office:word" xmlns:w="http://schemas.openxmlformats.org/wordprocessingml/2006/main" xmlns:w14="http://schemas.microsoft.com/office/word/2010/wordml" xmlns:w15="http://schemas.microsoft.com/office/word/2012/wordml" xmlns:w16cex="http://schemas.microsoft.com/office/word/2018/wordml/cex" xmlns:w16cid="http://schemas.microsoft.com/office/word/2016/wordml/cid" xmlns:w16="http://schemas.microsoft.com/office/word/2018/wordml" xmlns:w16du="http://schemas.microsoft.com/office/word/2023/wordml/word16du" xmlns:w16sdtdh="http://schemas.microsoft.com/office/word/2020/wordml/sdtdatahash" xmlns:w16sdtfl="http://schemas.microsoft.com/office/word/2024/wordml/sdtformatlock" xmlns:w16se="http://schemas.microsoft.com/office/word/2015/wordml/symex" xmlns:wpg="http://schemas.microsoft.com/office/word/2010/wordprocessingGroup" xmlns:wpi="http://schemas.microsoft.com/office/word/2010/wordprocessingInk" xmlns:wne="http://schemas.microsoft.com/office/word/2006/wordml" xmlns:wps="http://schemas.microsoft.com/office/word/2010/wordprocessingShape" mc:Ignorable="w14 w15 w16se w16cid w16 w16cex w16sdtdh w16sdtfl w16du wp14">
   <w:p>
     <w:pPr>
       <w:pStyle w:val="Fuzeile"/>
@@ -8477,7 +7949,7 @@
 </file>
 
 <file path=word/footnotes.xml><?xml version="1.0" encoding="utf-8"?>
-<w:footnotes xmlns:wpc="http://schemas.microsoft.com/office/word/2010/wordprocessingCanvas" xmlns:cx="http://schemas.microsoft.com/office/drawing/2014/chartex" xmlns:cx1="http://schemas.microsoft.com/office/drawing/2015/9/8/chartex" xmlns:cx2="http://schemas.microsoft.com/office/drawing/2015/10/21/chartex" xmlns:cx3="http://schemas.microsoft.com/office/drawing/2016/5/9/chartex" xmlns:cx4="http://schemas.microsoft.com/office/drawing/2016/5/10/chartex" xmlns:cx5="http://schemas.microsoft.com/office/drawing/2016/5/11/chartex" xmlns:cx6="http://schemas.microsoft.com/office/drawing/2016/5/12/chartex" xmlns:cx7="http://schemas.microsoft.com/office/drawing/2016/5/13/chartex" xmlns:cx8="http://schemas.microsoft.com/office/drawing/2016/5/14/chartex" xmlns:mc="http://schemas.openxmlformats.org/markup-compatibility/2006" xmlns:aink="http://schemas.microsoft.com/office/drawing/2016/ink" xmlns:am3d="http://schemas.microsoft.com/office/drawing/2017/model3d" xmlns:o="urn:schemas-microsoft-com:office:office" xmlns:oel="http://schemas.microsoft.com/office/2019/extlst" xmlns:r="http://schemas.openxmlformats.org/officeDocument/2006/relationships" xmlns:m="http://schemas.openxmlformats.org/officeDocument/2006/math" xmlns:v="urn:schemas-microsoft-com:vml" xmlns:wp14="http://schemas.microsoft.com/office/word/2010/wordprocessingDrawing" xmlns:wp="http://schemas.openxmlformats.org/drawingml/2006/wordprocessingDrawing" xmlns:w10="urn:schemas-microsoft-com:office:word" xmlns:w="http://schemas.openxmlformats.org/wordprocessingml/2006/main" xmlns:w14="http://schemas.microsoft.com/office/word/2010/wordml" xmlns:w15="http://schemas.microsoft.com/office/word/2012/wordml" xmlns:w16cex="http://schemas.microsoft.com/office/word/2018/wordml/cex" xmlns:w16cid="http://schemas.microsoft.com/office/word/2016/wordml/cid" xmlns:w16="http://schemas.microsoft.com/office/word/2018/wordml" xmlns:w16sdtdh="http://schemas.microsoft.com/office/word/2020/wordml/sdtdatahash" xmlns:w16se="http://schemas.microsoft.com/office/word/2015/wordml/symex" xmlns:wpg="http://schemas.microsoft.com/office/word/2010/wordprocessingGroup" xmlns:wpi="http://schemas.microsoft.com/office/word/2010/wordprocessingInk" xmlns:wne="http://schemas.microsoft.com/office/word/2006/wordml" xmlns:wps="http://schemas.microsoft.com/office/word/2010/wordprocessingShape" mc:Ignorable="w14 w15 w16se w16cid w16 w16cex w16sdtdh wp14">
+<w:footnotes xmlns:wpc="http://schemas.microsoft.com/office/word/2010/wordprocessingCanvas" xmlns:cx="http://schemas.microsoft.com/office/drawing/2014/chartex" xmlns:cx1="http://schemas.microsoft.com/office/drawing/2015/9/8/chartex" xmlns:cx2="http://schemas.microsoft.com/office/drawing/2015/10/21/chartex" xmlns:cx3="http://schemas.microsoft.com/office/drawing/2016/5/9/chartex" xmlns:cx4="http://schemas.microsoft.com/office/drawing/2016/5/10/chartex" xmlns:cx5="http://schemas.microsoft.com/office/drawing/2016/5/11/chartex" xmlns:cx6="http://schemas.microsoft.com/office/drawing/2016/5/12/chartex" xmlns:cx7="http://schemas.microsoft.com/office/drawing/2016/5/13/chartex" xmlns:cx8="http://schemas.microsoft.com/office/drawing/2016/5/14/chartex" xmlns:mc="http://schemas.openxmlformats.org/markup-compatibility/2006" xmlns:aink="http://schemas.microsoft.com/office/drawing/2016/ink" xmlns:am3d="http://schemas.microsoft.com/office/drawing/2017/model3d" xmlns:o="urn:schemas-microsoft-com:office:office" xmlns:oel="http://schemas.microsoft.com/office/2019/extlst" xmlns:r="http://schemas.openxmlformats.org/officeDocument/2006/relationships" xmlns:m="http://schemas.openxmlformats.org/officeDocument/2006/math" xmlns:v="urn:schemas-microsoft-com:vml" xmlns:wp14="http://schemas.microsoft.com/office/word/2010/wordprocessingDrawing" xmlns:wp="http://schemas.openxmlformats.org/drawingml/2006/wordprocessingDrawing" xmlns:w10="urn:schemas-microsoft-com:office:word" xmlns:w="http://schemas.openxmlformats.org/wordprocessingml/2006/main" xmlns:w14="http://schemas.microsoft.com/office/word/2010/wordml" xmlns:w15="http://schemas.microsoft.com/office/word/2012/wordml" xmlns:w16cex="http://schemas.microsoft.com/office/word/2018/wordml/cex" xmlns:w16cid="http://schemas.microsoft.com/office/word/2016/wordml/cid" xmlns:w16="http://schemas.microsoft.com/office/word/2018/wordml" xmlns:w16du="http://schemas.microsoft.com/office/word/2023/wordml/word16du" xmlns:w16sdtdh="http://schemas.microsoft.com/office/word/2020/wordml/sdtdatahash" xmlns:w16sdtfl="http://schemas.microsoft.com/office/word/2024/wordml/sdtformatlock" xmlns:w16se="http://schemas.microsoft.com/office/word/2015/wordml/symex" xmlns:wpg="http://schemas.microsoft.com/office/word/2010/wordprocessingGroup" xmlns:wpi="http://schemas.microsoft.com/office/word/2010/wordprocessingInk" xmlns:wne="http://schemas.microsoft.com/office/word/2006/wordml" xmlns:wps="http://schemas.microsoft.com/office/word/2010/wordprocessingShape" mc:Ignorable="w14 w15 w16se w16cid w16 w16cex w16sdtdh w16sdtfl w16du wp14">
   <w:footnote w:type="separator" w:id="-1">
     <w:p>
       <w:pPr>
@@ -8509,7 +7981,7 @@
 </file>
 
 <file path=word/header1.xml><?xml version="1.0" encoding="utf-8"?>
-<w:hdr xmlns:wpc="http://schemas.microsoft.com/office/word/2010/wordprocessingCanvas" xmlns:cx="http://schemas.microsoft.com/office/drawing/2014/chartex" xmlns:cx1="http://schemas.microsoft.com/office/drawing/2015/9/8/chartex" xmlns:cx2="http://schemas.microsoft.com/office/drawing/2015/10/21/chartex" xmlns:cx3="http://schemas.microsoft.com/office/drawing/2016/5/9/chartex" xmlns:cx4="http://schemas.microsoft.com/office/drawing/2016/5/10/chartex" xmlns:cx5="http://schemas.microsoft.com/office/drawing/2016/5/11/chartex" xmlns:cx6="http://schemas.microsoft.com/office/drawing/2016/5/12/chartex" xmlns:cx7="http://schemas.microsoft.com/office/drawing/2016/5/13/chartex" xmlns:cx8="http://schemas.microsoft.com/office/drawing/2016/5/14/chartex" xmlns:mc="http://schemas.openxmlformats.org/markup-compatibility/2006" xmlns:aink="http://schemas.microsoft.com/office/drawing/2016/ink" xmlns:am3d="http://schemas.microsoft.com/office/drawing/2017/model3d" xmlns:o="urn:schemas-microsoft-com:office:office" xmlns:oel="http://schemas.microsoft.com/office/2019/extlst" xmlns:r="http://schemas.openxmlformats.org/officeDocument/2006/relationships" xmlns:m="http://schemas.openxmlformats.org/officeDocument/2006/math" xmlns:v="urn:schemas-microsoft-com:vml" xmlns:wp14="http://schemas.microsoft.com/office/word/2010/wordprocessingDrawing" xmlns:wp="http://schemas.openxmlformats.org/drawingml/2006/wordprocessingDrawing" xmlns:w10="urn:schemas-microsoft-com:office:word" xmlns:w="http://schemas.openxmlformats.org/wordprocessingml/2006/main" xmlns:w14="http://schemas.microsoft.com/office/word/2010/wordml" xmlns:w15="http://schemas.microsoft.com/office/word/2012/wordml" xmlns:w16cex="http://schemas.microsoft.com/office/word/2018/wordml/cex" xmlns:w16cid="http://schemas.microsoft.com/office/word/2016/wordml/cid" xmlns:w16="http://schemas.microsoft.com/office/word/2018/wordml" xmlns:w16sdtdh="http://schemas.microsoft.com/office/word/2020/wordml/sdtdatahash" xmlns:w16se="http://schemas.microsoft.com/office/word/2015/wordml/symex" xmlns:wpg="http://schemas.microsoft.com/office/word/2010/wordprocessingGroup" xmlns:wpi="http://schemas.microsoft.com/office/word/2010/wordprocessingInk" xmlns:wne="http://schemas.microsoft.com/office/word/2006/wordml" xmlns:wps="http://schemas.microsoft.com/office/word/2010/wordprocessingShape" mc:Ignorable="w14 w15 w16se w16cid w16 w16cex w16sdtdh wp14">
+<w:hdr xmlns:wpc="http://schemas.microsoft.com/office/word/2010/wordprocessingCanvas" xmlns:cx="http://schemas.microsoft.com/office/drawing/2014/chartex" xmlns:cx1="http://schemas.microsoft.com/office/drawing/2015/9/8/chartex" xmlns:cx2="http://schemas.microsoft.com/office/drawing/2015/10/21/chartex" xmlns:cx3="http://schemas.microsoft.com/office/drawing/2016/5/9/chartex" xmlns:cx4="http://schemas.microsoft.com/office/drawing/2016/5/10/chartex" xmlns:cx5="http://schemas.microsoft.com/office/drawing/2016/5/11/chartex" xmlns:cx6="http://schemas.microsoft.com/office/drawing/2016/5/12/chartex" xmlns:cx7="http://schemas.microsoft.com/office/drawing/2016/5/13/chartex" xmlns:cx8="http://schemas.microsoft.com/office/drawing/2016/5/14/chartex" xmlns:mc="http://schemas.openxmlformats.org/markup-compatibility/2006" xmlns:aink="http://schemas.microsoft.com/office/drawing/2016/ink" xmlns:am3d="http://schemas.microsoft.com/office/drawing/2017/model3d" xmlns:o="urn:schemas-microsoft-com:office:office" xmlns:oel="http://schemas.microsoft.com/office/2019/extlst" xmlns:r="http://schemas.openxmlformats.org/officeDocument/2006/relationships" xmlns:m="http://schemas.openxmlformats.org/officeDocument/2006/math" xmlns:v="urn:schemas-microsoft-com:vml" xmlns:wp14="http://schemas.microsoft.com/office/word/2010/wordprocessingDrawing" xmlns:wp="http://schemas.openxmlformats.org/drawingml/2006/wordprocessingDrawing" xmlns:w10="urn:schemas-microsoft-com:office:word" xmlns:w="http://schemas.openxmlformats.org/wordprocessingml/2006/main" xmlns:w14="http://schemas.microsoft.com/office/word/2010/wordml" xmlns:w15="http://schemas.microsoft.com/office/word/2012/wordml" xmlns:w16cex="http://schemas.microsoft.com/office/word/2018/wordml/cex" xmlns:w16cid="http://schemas.microsoft.com/office/word/2016/wordml/cid" xmlns:w16="http://schemas.microsoft.com/office/word/2018/wordml" xmlns:w16du="http://schemas.microsoft.com/office/word/2023/wordml/word16du" xmlns:w16sdtdh="http://schemas.microsoft.com/office/word/2020/wordml/sdtdatahash" xmlns:w16sdtfl="http://schemas.microsoft.com/office/word/2024/wordml/sdtformatlock" xmlns:w16se="http://schemas.microsoft.com/office/word/2015/wordml/symex" xmlns:wpg="http://schemas.microsoft.com/office/word/2010/wordprocessingGroup" xmlns:wpi="http://schemas.microsoft.com/office/word/2010/wordprocessingInk" xmlns:wne="http://schemas.microsoft.com/office/word/2006/wordml" xmlns:wps="http://schemas.microsoft.com/office/word/2010/wordprocessingShape" mc:Ignorable="w14 w15 w16se w16cid w16 w16cex w16sdtdh w16sdtfl w16du wp14">
   <w:p>
     <w:pPr>
       <w:pStyle w:val="Kopfzeile"/>
@@ -8651,7 +8123,7 @@
 </file>
 
 <file path=word/header2.xml><?xml version="1.0" encoding="utf-8"?>
-<w:hdr xmlns:wpc="http://schemas.microsoft.com/office/word/2010/wordprocessingCanvas" xmlns:cx="http://schemas.microsoft.com/office/drawing/2014/chartex" xmlns:cx1="http://schemas.microsoft.com/office/drawing/2015/9/8/chartex" xmlns:cx2="http://schemas.microsoft.com/office/drawing/2015/10/21/chartex" xmlns:cx3="http://schemas.microsoft.com/office/drawing/2016/5/9/chartex" xmlns:cx4="http://schemas.microsoft.com/office/drawing/2016/5/10/chartex" xmlns:cx5="http://schemas.microsoft.com/office/drawing/2016/5/11/chartex" xmlns:cx6="http://schemas.microsoft.com/office/drawing/2016/5/12/chartex" xmlns:cx7="http://schemas.microsoft.com/office/drawing/2016/5/13/chartex" xmlns:cx8="http://schemas.microsoft.com/office/drawing/2016/5/14/chartex" xmlns:mc="http://schemas.openxmlformats.org/markup-compatibility/2006" xmlns:aink="http://schemas.microsoft.com/office/drawing/2016/ink" xmlns:am3d="http://schemas.microsoft.com/office/drawing/2017/model3d" xmlns:o="urn:schemas-microsoft-com:office:office" xmlns:oel="http://schemas.microsoft.com/office/2019/extlst" xmlns:r="http://schemas.openxmlformats.org/officeDocument/2006/relationships" xmlns:m="http://schemas.openxmlformats.org/officeDocument/2006/math" xmlns:v="urn:schemas-microsoft-com:vml" xmlns:wp14="http://schemas.microsoft.com/office/word/2010/wordprocessingDrawing" xmlns:wp="http://schemas.openxmlformats.org/drawingml/2006/wordprocessingDrawing" xmlns:w10="urn:schemas-microsoft-com:office:word" xmlns:w="http://schemas.openxmlformats.org/wordprocessingml/2006/main" xmlns:w14="http://schemas.microsoft.com/office/word/2010/wordml" xmlns:w15="http://schemas.microsoft.com/office/word/2012/wordml" xmlns:w16cex="http://schemas.microsoft.com/office/word/2018/wordml/cex" xmlns:w16cid="http://schemas.microsoft.com/office/word/2016/wordml/cid" xmlns:w16="http://schemas.microsoft.com/office/word/2018/wordml" xmlns:w16sdtdh="http://schemas.microsoft.com/office/word/2020/wordml/sdtdatahash" xmlns:w16se="http://schemas.microsoft.com/office/word/2015/wordml/symex" xmlns:wpg="http://schemas.microsoft.com/office/word/2010/wordprocessingGroup" xmlns:wpi="http://schemas.microsoft.com/office/word/2010/wordprocessingInk" xmlns:wne="http://schemas.microsoft.com/office/word/2006/wordml" xmlns:wps="http://schemas.microsoft.com/office/word/2010/wordprocessingShape" mc:Ignorable="w14 w15 w16se w16cid w16 w16cex w16sdtdh wp14">
+<w:hdr xmlns:wpc="http://schemas.microsoft.com/office/word/2010/wordprocessingCanvas" xmlns:cx="http://schemas.microsoft.com/office/drawing/2014/chartex" xmlns:cx1="http://schemas.microsoft.com/office/drawing/2015/9/8/chartex" xmlns:cx2="http://schemas.microsoft.com/office/drawing/2015/10/21/chartex" xmlns:cx3="http://schemas.microsoft.com/office/drawing/2016/5/9/chartex" xmlns:cx4="http://schemas.microsoft.com/office/drawing/2016/5/10/chartex" xmlns:cx5="http://schemas.microsoft.com/office/drawing/2016/5/11/chartex" xmlns:cx6="http://schemas.microsoft.com/office/drawing/2016/5/12/chartex" xmlns:cx7="http://schemas.microsoft.com/office/drawing/2016/5/13/chartex" xmlns:cx8="http://schemas.microsoft.com/office/drawing/2016/5/14/chartex" xmlns:mc="http://schemas.openxmlformats.org/markup-compatibility/2006" xmlns:aink="http://schemas.microsoft.com/office/drawing/2016/ink" xmlns:am3d="http://schemas.microsoft.com/office/drawing/2017/model3d" xmlns:o="urn:schemas-microsoft-com:office:office" xmlns:oel="http://schemas.microsoft.com/office/2019/extlst" xmlns:r="http://schemas.openxmlformats.org/officeDocument/2006/relationships" xmlns:m="http://schemas.openxmlformats.org/officeDocument/2006/math" xmlns:v="urn:schemas-microsoft-com:vml" xmlns:wp14="http://schemas.microsoft.com/office/word/2010/wordprocessingDrawing" xmlns:wp="http://schemas.openxmlformats.org/drawingml/2006/wordprocessingDrawing" xmlns:w10="urn:schemas-microsoft-com:office:word" xmlns:w="http://schemas.openxmlformats.org/wordprocessingml/2006/main" xmlns:w14="http://schemas.microsoft.com/office/word/2010/wordml" xmlns:w15="http://schemas.microsoft.com/office/word/2012/wordml" xmlns:w16cex="http://schemas.microsoft.com/office/word/2018/wordml/cex" xmlns:w16cid="http://schemas.microsoft.com/office/word/2016/wordml/cid" xmlns:w16="http://schemas.microsoft.com/office/word/2018/wordml" xmlns:w16du="http://schemas.microsoft.com/office/word/2023/wordml/word16du" xmlns:w16sdtdh="http://schemas.microsoft.com/office/word/2020/wordml/sdtdatahash" xmlns:w16sdtfl="http://schemas.microsoft.com/office/word/2024/wordml/sdtformatlock" xmlns:w16se="http://schemas.microsoft.com/office/word/2015/wordml/symex" xmlns:wpg="http://schemas.microsoft.com/office/word/2010/wordprocessingGroup" xmlns:wpi="http://schemas.microsoft.com/office/word/2010/wordprocessingInk" xmlns:wne="http://schemas.microsoft.com/office/word/2006/wordml" xmlns:wps="http://schemas.microsoft.com/office/word/2010/wordprocessingShape" mc:Ignorable="w14 w15 w16se w16cid w16 w16cex w16sdtdh w16sdtfl w16du wp14">
   <w:p>
     <w:pPr>
       <w:pStyle w:val="Kopfzeile"/>
@@ -8709,7 +8181,7 @@
 </file>
 
 <file path=word/header3.xml><?xml version="1.0" encoding="utf-8"?>
-<w:hdr xmlns:wpc="http://schemas.microsoft.com/office/word/2010/wordprocessingCanvas" xmlns:cx="http://schemas.microsoft.com/office/drawing/2014/chartex" xmlns:cx1="http://schemas.microsoft.com/office/drawing/2015/9/8/chartex" xmlns:cx2="http://schemas.microsoft.com/office/drawing/2015/10/21/chartex" xmlns:cx3="http://schemas.microsoft.com/office/drawing/2016/5/9/chartex" xmlns:cx4="http://schemas.microsoft.com/office/drawing/2016/5/10/chartex" xmlns:cx5="http://schemas.microsoft.com/office/drawing/2016/5/11/chartex" xmlns:cx6="http://schemas.microsoft.com/office/drawing/2016/5/12/chartex" xmlns:cx7="http://schemas.microsoft.com/office/drawing/2016/5/13/chartex" xmlns:cx8="http://schemas.microsoft.com/office/drawing/2016/5/14/chartex" xmlns:mc="http://schemas.openxmlformats.org/markup-compatibility/2006" xmlns:aink="http://schemas.microsoft.com/office/drawing/2016/ink" xmlns:am3d="http://schemas.microsoft.com/office/drawing/2017/model3d" xmlns:o="urn:schemas-microsoft-com:office:office" xmlns:oel="http://schemas.microsoft.com/office/2019/extlst" xmlns:r="http://schemas.openxmlformats.org/officeDocument/2006/relationships" xmlns:m="http://schemas.openxmlformats.org/officeDocument/2006/math" xmlns:v="urn:schemas-microsoft-com:vml" xmlns:wp14="http://schemas.microsoft.com/office/word/2010/wordprocessingDrawing" xmlns:wp="http://schemas.openxmlformats.org/drawingml/2006/wordprocessingDrawing" xmlns:w10="urn:schemas-microsoft-com:office:word" xmlns:w="http://schemas.openxmlformats.org/wordprocessingml/2006/main" xmlns:w14="http://schemas.microsoft.com/office/word/2010/wordml" xmlns:w15="http://schemas.microsoft.com/office/word/2012/wordml" xmlns:w16cex="http://schemas.microsoft.com/office/word/2018/wordml/cex" xmlns:w16cid="http://schemas.microsoft.com/office/word/2016/wordml/cid" xmlns:w16="http://schemas.microsoft.com/office/word/2018/wordml" xmlns:w16sdtdh="http://schemas.microsoft.com/office/word/2020/wordml/sdtdatahash" xmlns:w16se="http://schemas.microsoft.com/office/word/2015/wordml/symex" xmlns:wpg="http://schemas.microsoft.com/office/word/2010/wordprocessingGroup" xmlns:wpi="http://schemas.microsoft.com/office/word/2010/wordprocessingInk" xmlns:wne="http://schemas.microsoft.com/office/word/2006/wordml" xmlns:wps="http://schemas.microsoft.com/office/word/2010/wordprocessingShape" mc:Ignorable="w14 w15 w16se w16cid w16 w16cex w16sdtdh wp14">
+<w:hdr xmlns:wpc="http://schemas.microsoft.com/office/word/2010/wordprocessingCanvas" xmlns:cx="http://schemas.microsoft.com/office/drawing/2014/chartex" xmlns:cx1="http://schemas.microsoft.com/office/drawing/2015/9/8/chartex" xmlns:cx2="http://schemas.microsoft.com/office/drawing/2015/10/21/chartex" xmlns:cx3="http://schemas.microsoft.com/office/drawing/2016/5/9/chartex" xmlns:cx4="http://schemas.microsoft.com/office/drawing/2016/5/10/chartex" xmlns:cx5="http://schemas.microsoft.com/office/drawing/2016/5/11/chartex" xmlns:cx6="http://schemas.microsoft.com/office/drawing/2016/5/12/chartex" xmlns:cx7="http://schemas.microsoft.com/office/drawing/2016/5/13/chartex" xmlns:cx8="http://schemas.microsoft.com/office/drawing/2016/5/14/chartex" xmlns:mc="http://schemas.openxmlformats.org/markup-compatibility/2006" xmlns:aink="http://schemas.microsoft.com/office/drawing/2016/ink" xmlns:am3d="http://schemas.microsoft.com/office/drawing/2017/model3d" xmlns:o="urn:schemas-microsoft-com:office:office" xmlns:oel="http://schemas.microsoft.com/office/2019/extlst" xmlns:r="http://schemas.openxmlformats.org/officeDocument/2006/relationships" xmlns:m="http://schemas.openxmlformats.org/officeDocument/2006/math" xmlns:v="urn:schemas-microsoft-com:vml" xmlns:wp14="http://schemas.microsoft.com/office/word/2010/wordprocessingDrawing" xmlns:wp="http://schemas.openxmlformats.org/drawingml/2006/wordprocessingDrawing" xmlns:w10="urn:schemas-microsoft-com:office:word" xmlns:w="http://schemas.openxmlformats.org/wordprocessingml/2006/main" xmlns:w14="http://schemas.microsoft.com/office/word/2010/wordml" xmlns:w15="http://schemas.microsoft.com/office/word/2012/wordml" xmlns:w16cex="http://schemas.microsoft.com/office/word/2018/wordml/cex" xmlns:w16cid="http://schemas.microsoft.com/office/word/2016/wordml/cid" xmlns:w16="http://schemas.microsoft.com/office/word/2018/wordml" xmlns:w16du="http://schemas.microsoft.com/office/word/2023/wordml/word16du" xmlns:w16sdtdh="http://schemas.microsoft.com/office/word/2020/wordml/sdtdatahash" xmlns:w16sdtfl="http://schemas.microsoft.com/office/word/2024/wordml/sdtformatlock" xmlns:w16se="http://schemas.microsoft.com/office/word/2015/wordml/symex" xmlns:wpg="http://schemas.microsoft.com/office/word/2010/wordprocessingGroup" xmlns:wpi="http://schemas.microsoft.com/office/word/2010/wordprocessingInk" xmlns:wne="http://schemas.microsoft.com/office/word/2006/wordml" xmlns:wps="http://schemas.microsoft.com/office/word/2010/wordprocessingShape" mc:Ignorable="w14 w15 w16se w16cid w16 w16cex w16sdtdh w16sdtfl w16du wp14">
   <w:p>
     <w:pPr>
       <w:pStyle w:val="Kopfzeile"/>
@@ -8718,12 +8190,7 @@
       <w:rPr>
         <w:noProof/>
       </w:rPr>
-    </w:r>
-    <w:r>
-      <w:rPr>
-        <w:noProof/>
-      </w:rPr>
-      <w:pict w14:anchorId="4C2A2D67">
+      <w:pict w14:anchorId="0BDD40AE">
         <v:shapetype id="_x0000_t136" coordsize="21600,21600" o:spt="136" adj="10800" path="m@7,l@8,m@5,21600l@6,21600e">
           <v:formulas>
             <v:f eqn="sum #0 0 10800"/>
@@ -8748,7 +8215,7 @@
           </v:handles>
           <o:lock v:ext="edit" text="t" shapetype="t"/>
         </v:shapetype>
-        <v:shape id="PowerPlusWaterMarkObject" o:spid="_x0000_s1026" type="#_x0000_t136" alt="" style="position:absolute;margin-left:0;margin-top:0;width:499.5pt;height:139.85pt;rotation:315;z-index:-251658240;mso-wrap-edited:f;mso-width-percent:0;mso-height-percent:0;mso-position-horizontal:center;mso-position-horizontal-relative:margin;mso-position-vertical:center;mso-position-vertical-relative:margin;mso-width-percent:0;mso-height-percent:0" o:allowincell="f" fillcolor="silver" stroked="f">
+        <v:shape id="PowerPlusWaterMarkObject" o:spid="_x0000_s1025" type="#_x0000_t136" alt="" style="position:absolute;margin-left:0;margin-top:0;width:499.5pt;height:139.85pt;rotation:315;z-index:-251658240;mso-wrap-edited:f;mso-width-percent:0;mso-height-percent:0;mso-position-horizontal:center;mso-position-horizontal-relative:margin;mso-position-vertical:center;mso-position-vertical-relative:margin;mso-width-percent:0;mso-height-percent:0" o:allowincell="f" fillcolor="silver" stroked="f">
           <v:textpath style="font-family:&quot;Calibri&quot;;font-size:1pt" string="ENTWURF"/>
           <w10:wrap anchorx="margin" anchory="margin"/>
         </v:shape>
@@ -8759,7 +8226,7 @@
 </file>
 
 <file path=word/numbering.xml><?xml version="1.0" encoding="utf-8"?>
-<w:numbering xmlns:wpc="http://schemas.microsoft.com/office/word/2010/wordprocessingCanvas" xmlns:cx="http://schemas.microsoft.com/office/drawing/2014/chartex" xmlns:cx1="http://schemas.microsoft.com/office/drawing/2015/9/8/chartex" xmlns:cx2="http://schemas.microsoft.com/office/drawing/2015/10/21/chartex" xmlns:cx3="http://schemas.microsoft.com/office/drawing/2016/5/9/chartex" xmlns:cx4="http://schemas.microsoft.com/office/drawing/2016/5/10/chartex" xmlns:cx5="http://schemas.microsoft.com/office/drawing/2016/5/11/chartex" xmlns:cx6="http://schemas.microsoft.com/office/drawing/2016/5/12/chartex" xmlns:cx7="http://schemas.microsoft.com/office/drawing/2016/5/13/chartex" xmlns:cx8="http://schemas.microsoft.com/office/drawing/2016/5/14/chartex" xmlns:mc="http://schemas.openxmlformats.org/markup-compatibility/2006" xmlns:aink="http://schemas.microsoft.com/office/drawing/2016/ink" xmlns:am3d="http://schemas.microsoft.com/office/drawing/2017/model3d" xmlns:o="urn:schemas-microsoft-com:office:office" xmlns:oel="http://schemas.microsoft.com/office/2019/extlst" xmlns:r="http://schemas.openxmlformats.org/officeDocument/2006/relationships" xmlns:m="http://schemas.openxmlformats.org/officeDocument/2006/math" xmlns:v="urn:schemas-microsoft-com:vml" xmlns:wp14="http://schemas.microsoft.com/office/word/2010/wordprocessingDrawing" xmlns:wp="http://schemas.openxmlformats.org/drawingml/2006/wordprocessingDrawing" xmlns:w10="urn:schemas-microsoft-com:office:word" xmlns:w="http://schemas.openxmlformats.org/wordprocessingml/2006/main" xmlns:w14="http://schemas.microsoft.com/office/word/2010/wordml" xmlns:w15="http://schemas.microsoft.com/office/word/2012/wordml" xmlns:w16cex="http://schemas.microsoft.com/office/word/2018/wordml/cex" xmlns:w16cid="http://schemas.microsoft.com/office/word/2016/wordml/cid" xmlns:w16="http://schemas.microsoft.com/office/word/2018/wordml" xmlns:w16sdtdh="http://schemas.microsoft.com/office/word/2020/wordml/sdtdatahash" xmlns:w16se="http://schemas.microsoft.com/office/word/2015/wordml/symex" xmlns:wpg="http://schemas.microsoft.com/office/word/2010/wordprocessingGroup" xmlns:wpi="http://schemas.microsoft.com/office/word/2010/wordprocessingInk" xmlns:wne="http://schemas.microsoft.com/office/word/2006/wordml" xmlns:wps="http://schemas.microsoft.com/office/word/2010/wordprocessingShape" mc:Ignorable="w14 w15 w16se w16cid w16 w16cex w16sdtdh wp14">
+<w:numbering xmlns:wpc="http://schemas.microsoft.com/office/word/2010/wordprocessingCanvas" xmlns:cx="http://schemas.microsoft.com/office/drawing/2014/chartex" xmlns:cx1="http://schemas.microsoft.com/office/drawing/2015/9/8/chartex" xmlns:cx2="http://schemas.microsoft.com/office/drawing/2015/10/21/chartex" xmlns:cx3="http://schemas.microsoft.com/office/drawing/2016/5/9/chartex" xmlns:cx4="http://schemas.microsoft.com/office/drawing/2016/5/10/chartex" xmlns:cx5="http://schemas.microsoft.com/office/drawing/2016/5/11/chartex" xmlns:cx6="http://schemas.microsoft.com/office/drawing/2016/5/12/chartex" xmlns:cx7="http://schemas.microsoft.com/office/drawing/2016/5/13/chartex" xmlns:cx8="http://schemas.microsoft.com/office/drawing/2016/5/14/chartex" xmlns:mc="http://schemas.openxmlformats.org/markup-compatibility/2006" xmlns:aink="http://schemas.microsoft.com/office/drawing/2016/ink" xmlns:am3d="http://schemas.microsoft.com/office/drawing/2017/model3d" xmlns:o="urn:schemas-microsoft-com:office:office" xmlns:oel="http://schemas.microsoft.com/office/2019/extlst" xmlns:r="http://schemas.openxmlformats.org/officeDocument/2006/relationships" xmlns:m="http://schemas.openxmlformats.org/officeDocument/2006/math" xmlns:v="urn:schemas-microsoft-com:vml" xmlns:wp14="http://schemas.microsoft.com/office/word/2010/wordprocessingDrawing" xmlns:wp="http://schemas.openxmlformats.org/drawingml/2006/wordprocessingDrawing" xmlns:w10="urn:schemas-microsoft-com:office:word" xmlns:w="http://schemas.openxmlformats.org/wordprocessingml/2006/main" xmlns:w14="http://schemas.microsoft.com/office/word/2010/wordml" xmlns:w15="http://schemas.microsoft.com/office/word/2012/wordml" xmlns:w16cex="http://schemas.microsoft.com/office/word/2018/wordml/cex" xmlns:w16cid="http://schemas.microsoft.com/office/word/2016/wordml/cid" xmlns:w16="http://schemas.microsoft.com/office/word/2018/wordml" xmlns:w16du="http://schemas.microsoft.com/office/word/2023/wordml/word16du" xmlns:w16sdtdh="http://schemas.microsoft.com/office/word/2020/wordml/sdtdatahash" xmlns:w16sdtfl="http://schemas.microsoft.com/office/word/2024/wordml/sdtformatlock" xmlns:w16se="http://schemas.microsoft.com/office/word/2015/wordml/symex" xmlns:wpg="http://schemas.microsoft.com/office/word/2010/wordprocessingGroup" xmlns:wpi="http://schemas.microsoft.com/office/word/2010/wordprocessingInk" xmlns:wne="http://schemas.microsoft.com/office/word/2006/wordml" xmlns:wps="http://schemas.microsoft.com/office/word/2010/wordprocessingShape" mc:Ignorable="w14 w15 w16se w16cid w16 w16cex w16sdtdh w16sdtfl w16du wp14">
   <w:abstractNum w:abstractNumId="0" w15:restartNumberingAfterBreak="0">
     <w:nsid w:val="011BB45B"/>
     <w:multiLevelType w:val="hybridMultilevel"/>
@@ -12372,7 +11839,7 @@
 </file>
 
 <file path=word/styles.xml><?xml version="1.0" encoding="utf-8"?>
-<w:styles xmlns:mc="http://schemas.openxmlformats.org/markup-compatibility/2006" xmlns:r="http://schemas.openxmlformats.org/officeDocument/2006/relationships" xmlns:w="http://schemas.openxmlformats.org/wordprocessingml/2006/main" xmlns:w14="http://schemas.microsoft.com/office/word/2010/wordml" xmlns:w15="http://schemas.microsoft.com/office/word/2012/wordml" xmlns:w16cex="http://schemas.microsoft.com/office/word/2018/wordml/cex" xmlns:w16cid="http://schemas.microsoft.com/office/word/2016/wordml/cid" xmlns:w16="http://schemas.microsoft.com/office/word/2018/wordml" xmlns:w16sdtdh="http://schemas.microsoft.com/office/word/2020/wordml/sdtdatahash" xmlns:w16se="http://schemas.microsoft.com/office/word/2015/wordml/symex" mc:Ignorable="w14 w15 w16se w16cid w16 w16cex w16sdtdh">
+<w:styles xmlns:mc="http://schemas.openxmlformats.org/markup-compatibility/2006" xmlns:r="http://schemas.openxmlformats.org/officeDocument/2006/relationships" xmlns:w="http://schemas.openxmlformats.org/wordprocessingml/2006/main" xmlns:w14="http://schemas.microsoft.com/office/word/2010/wordml" xmlns:w15="http://schemas.microsoft.com/office/word/2012/wordml" xmlns:w16cex="http://schemas.microsoft.com/office/word/2018/wordml/cex" xmlns:w16cid="http://schemas.microsoft.com/office/word/2016/wordml/cid" xmlns:w16="http://schemas.microsoft.com/office/word/2018/wordml" xmlns:w16du="http://schemas.microsoft.com/office/word/2023/wordml/word16du" xmlns:w16sdtdh="http://schemas.microsoft.com/office/word/2020/wordml/sdtdatahash" xmlns:w16sdtfl="http://schemas.microsoft.com/office/word/2024/wordml/sdtformatlock" xmlns:w16se="http://schemas.microsoft.com/office/word/2015/wordml/symex" mc:Ignorable="w14 w15 w16se w16cid w16 w16cex w16sdtdh w16sdtfl w16du">
   <w:docDefaults>
     <w:rPrDefault>
       <w:rPr>
@@ -13710,6 +13177,10 @@
 </file>
 
 <file path=customXml/item1.xml><?xml version="1.0" encoding="utf-8"?>
+<b:Sources xmlns:b="http://schemas.openxmlformats.org/officeDocument/2006/bibliography" xmlns="http://schemas.openxmlformats.org/officeDocument/2006/bibliography" SelectedStyle="\APA.XSL" StyleName="APA"/>
+</file>
+
+<file path=customXml/item2.xml><?xml version="1.0" encoding="utf-8"?>
 <p:properties xmlns:p="http://schemas.microsoft.com/office/2006/metadata/properties" xmlns:xsi="http://www.w3.org/2001/XMLSchema-instance" xmlns:pc="http://schemas.microsoft.com/office/infopath/2007/PartnerControls">
   <documentManagement>
     <TaxCatchAll xmlns="1ebeb02f-ed16-49df-9ffa-f66b3202849c" xsi:nil="true"/>
@@ -13737,20 +13208,7 @@
 </p:properties>
 </file>
 
-<file path=customXml/item2.xml><?xml version="1.0" encoding="utf-8"?>
-<b:Sources xmlns:b="http://schemas.openxmlformats.org/officeDocument/2006/bibliography" xmlns="http://schemas.openxmlformats.org/officeDocument/2006/bibliography" SelectedStyle="\APA.XSL" StyleName="APA"/>
-</file>
-
 <file path=customXml/item3.xml><?xml version="1.0" encoding="utf-8"?>
-<?mso-contentType ?>
-<FormTemplates xmlns="http://schemas.microsoft.com/sharepoint/v3/contenttype/forms">
-  <Display>DocumentLibraryForm</Display>
-  <Edit>DocumentLibraryForm</Edit>
-  <New>DocumentLibraryForm</New>
-</FormTemplates>
-</file>
-
-<file path=customXml/item4.xml><?xml version="1.0" encoding="utf-8"?>
 <ct:contentTypeSchema xmlns:ct="http://schemas.microsoft.com/office/2006/metadata/contentType" xmlns:ma="http://schemas.microsoft.com/office/2006/metadata/properties/metaAttributes" ct:_="" ma:_="" ma:contentTypeName="Dokument" ma:contentTypeID="0x01010066F7BAD8B9DFCA4BA086D0DAEADBF05A" ma:contentTypeVersion="18" ma:contentTypeDescription="Ein neues Dokument erstellen." ma:contentTypeScope="" ma:versionID="26bfa2bb209f12277b6aeaccda06ec75">
   <xsd:schema xmlns:xsd="http://www.w3.org/2001/XMLSchema" xmlns:xs="http://www.w3.org/2001/XMLSchema" xmlns:p="http://schemas.microsoft.com/office/2006/metadata/properties" xmlns:ns2="2e12ef21-6b7c-4e02-a32e-1b50103336da" xmlns:ns3="1ebeb02f-ed16-49df-9ffa-f66b3202849c" targetNamespace="http://schemas.microsoft.com/office/2006/metadata/properties" ma:root="true" ma:fieldsID="19c14b9ea3d478648f8c3e04eb78ac9e" ns2:_="" ns3:_="">
     <xsd:import namespace="2e12ef21-6b7c-4e02-a32e-1b50103336da"/>
@@ -14005,7 +13463,24 @@
 </ct:contentTypeSchema>
 </file>
 
+<file path=customXml/item4.xml><?xml version="1.0" encoding="utf-8"?>
+<?mso-contentType ?>
+<FormTemplates xmlns="http://schemas.microsoft.com/sharepoint/v3/contenttype/forms">
+  <Display>DocumentLibraryForm</Display>
+  <Edit>DocumentLibraryForm</Edit>
+  <New>DocumentLibraryForm</New>
+</FormTemplates>
+</file>
+
 <file path=customXml/itemProps1.xml><?xml version="1.0" encoding="utf-8"?>
+<ds:datastoreItem xmlns:ds="http://schemas.openxmlformats.org/officeDocument/2006/customXml" ds:itemID="{5A72380C-CFB9-B74F-9BCF-33F01B1E2808}">
+  <ds:schemaRefs>
+    <ds:schemaRef ds:uri="http://schemas.openxmlformats.org/officeDocument/2006/bibliography"/>
+  </ds:schemaRefs>
+</ds:datastoreItem>
+</file>
+
+<file path=customXml/itemProps2.xml><?xml version="1.0" encoding="utf-8"?>
 <ds:datastoreItem xmlns:ds="http://schemas.openxmlformats.org/officeDocument/2006/customXml" ds:itemID="{2DB21DA6-BB69-4C77-B502-D43DFDE3335D}">
   <ds:schemaRefs>
     <ds:schemaRef ds:uri="http://schemas.microsoft.com/office/2006/metadata/properties"/>
@@ -14016,23 +13491,7 @@
 </ds:datastoreItem>
 </file>
 
-<file path=customXml/itemProps2.xml><?xml version="1.0" encoding="utf-8"?>
-<ds:datastoreItem xmlns:ds="http://schemas.openxmlformats.org/officeDocument/2006/customXml" ds:itemID="{5A72380C-CFB9-B74F-9BCF-33F01B1E2808}">
-  <ds:schemaRefs>
-    <ds:schemaRef ds:uri="http://schemas.openxmlformats.org/officeDocument/2006/bibliography"/>
-  </ds:schemaRefs>
-</ds:datastoreItem>
-</file>
-
 <file path=customXml/itemProps3.xml><?xml version="1.0" encoding="utf-8"?>
-<ds:datastoreItem xmlns:ds="http://schemas.openxmlformats.org/officeDocument/2006/customXml" ds:itemID="{2D299900-5ED1-41F3-B76C-F763C80DA726}">
-  <ds:schemaRefs>
-    <ds:schemaRef ds:uri="http://schemas.microsoft.com/sharepoint/v3/contenttype/forms"/>
-  </ds:schemaRefs>
-</ds:datastoreItem>
-</file>
-
-<file path=customXml/itemProps4.xml><?xml version="1.0" encoding="utf-8"?>
 <ds:datastoreItem xmlns:ds="http://schemas.openxmlformats.org/officeDocument/2006/customXml" ds:itemID="{A4C452D3-BE24-4D13-9794-4F69F3EF4E64}">
   <ds:schemaRefs>
     <ds:schemaRef ds:uri="http://schemas.microsoft.com/office/2006/metadata/contentType"/>
@@ -14049,4 +13508,12 @@
     <ds:schemaRef ds:uri="http://schemas.microsoft.com/internal/obd"/>
   </ds:schemaRefs>
 </ds:datastoreItem>
+</file>
+
+<file path=customXml/itemProps4.xml><?xml version="1.0" encoding="utf-8"?>
+<ds:datastoreItem xmlns:ds="http://schemas.openxmlformats.org/officeDocument/2006/customXml" ds:itemID="{2D299900-5ED1-41F3-B76C-F763C80DA726}">
+  <ds:schemaRefs>
+    <ds:schemaRef ds:uri="http://schemas.microsoft.com/sharepoint/v3/contenttype/forms"/>
+  </ds:schemaRefs>
+</ds:datastoreItem>
 </file>
</xml_diff>